<commit_message>
fix: Alterações no cartão CRC e nos arquivos html
</commit_message>
<xml_diff>
--- a/documentacao/Cartoes_CRC_Grupo4.docx
+++ b/documentacao/Cartoes_CRC_Grupo4.docx
@@ -1,29 +1,29 @@
 
 <file path=word/document.xml><?xml version="1.0" encoding="utf-8"?>
-<w:document xmlns:wpc="http://schemas.microsoft.com/office/word/2010/wordprocessingCanvas" xmlns:cx="http://schemas.microsoft.com/office/drawing/2014/chartex" xmlns:cx1="http://schemas.microsoft.com/office/drawing/2015/9/8/chartex" xmlns:cx2="http://schemas.microsoft.com/office/drawing/2015/10/21/chartex" xmlns:cx3="http://schemas.microsoft.com/office/drawing/2016/5/9/chartex" xmlns:cx4="http://schemas.microsoft.com/office/drawing/2016/5/10/chartex" xmlns:cx5="http://schemas.microsoft.com/office/drawing/2016/5/11/chartex" xmlns:cx6="http://schemas.microsoft.com/office/drawing/2016/5/12/chartex" xmlns:cx7="http://schemas.microsoft.com/office/drawing/2016/5/13/chartex" xmlns:cx8="http://schemas.microsoft.com/office/drawing/2016/5/14/chartex" xmlns:mc="http://schemas.openxmlformats.org/markup-compatibility/2006" xmlns:aink="http://schemas.microsoft.com/office/drawing/2016/ink" xmlns:am3d="http://schemas.microsoft.com/office/drawing/2017/model3d" xmlns:o="urn:schemas-microsoft-com:office:office" xmlns:oel="http://schemas.microsoft.com/office/2019/extlst" xmlns:r="http://schemas.openxmlformats.org/officeDocument/2006/relationships" xmlns:m="http://schemas.openxmlformats.org/officeDocument/2006/math" xmlns:v="urn:schemas-microsoft-com:vml" xmlns:wp14="http://schemas.microsoft.com/office/word/2010/wordprocessingDrawing" xmlns:wp="http://schemas.openxmlformats.org/drawingml/2006/wordprocessingDrawing" xmlns:w10="urn:schemas-microsoft-com:office:word" xmlns:w="http://schemas.openxmlformats.org/wordprocessingml/2006/main" xmlns:w14="http://schemas.microsoft.com/office/word/2010/wordml" xmlns:w15="http://schemas.microsoft.com/office/word/2012/wordml" xmlns:w16cex="http://schemas.microsoft.com/office/word/2018/wordml/cex" xmlns:w16cid="http://schemas.microsoft.com/office/word/2016/wordml/cid" xmlns:w16="http://schemas.microsoft.com/office/word/2018/wordml" xmlns:w16du="http://schemas.microsoft.com/office/word/2023/wordml/word16du" xmlns:w16sdtdh="http://schemas.microsoft.com/office/word/2020/wordml/sdtdatahash" xmlns:w16sdtfl="http://schemas.microsoft.com/office/word/2024/wordml/sdtformatlock" xmlns:w16se="http://schemas.microsoft.com/office/word/2015/wordml/symex" xmlns:wpg="http://schemas.microsoft.com/office/word/2010/wordprocessingGroup" xmlns:wpi="http://schemas.microsoft.com/office/word/2010/wordprocessingInk" xmlns:wne="http://schemas.microsoft.com/office/word/2006/wordml" xmlns:wps="http://schemas.microsoft.com/office/word/2010/wordprocessingShape" mc:Ignorable="w14 w15 w16se w16cid w16 w16cex w16sdtdh w16sdtfl w16du wp14">
+<w:document xmlns:wpc="http://schemas.microsoft.com/office/word/2010/wordprocessingCanvas" xmlns:mc="http://schemas.openxmlformats.org/markup-compatibility/2006" xmlns:o="urn:schemas-microsoft-com:office:office" xmlns:r="http://schemas.openxmlformats.org/officeDocument/2006/relationships" xmlns:m="http://schemas.openxmlformats.org/officeDocument/2006/math" xmlns:v="urn:schemas-microsoft-com:vml" xmlns:wp14="http://schemas.microsoft.com/office/word/2010/wordprocessingDrawing" xmlns:wp="http://schemas.openxmlformats.org/drawingml/2006/wordprocessingDrawing" xmlns:w10="urn:schemas-microsoft-com:office:word" xmlns:w="http://schemas.openxmlformats.org/wordprocessingml/2006/main" xmlns:w14="http://schemas.microsoft.com/office/word/2010/wordml" xmlns:w15="http://schemas.microsoft.com/office/word/2012/wordml" xmlns:w16se="http://schemas.microsoft.com/office/word/2015/wordml/symex" xmlns:w16cid="http://schemas.microsoft.com/office/word/2016/wordml/cid" xmlns:w16="http://schemas.microsoft.com/office/word/2018/wordml" xmlns:w16cex="http://schemas.microsoft.com/office/word/2018/wordml/cex" xmlns:w16sdtdh="http://schemas.microsoft.com/office/word/2020/wordml/sdtdatahash" xmlns:wne="http://schemas.microsoft.com/office/word/2006/wordml" xmlns:wpg="http://schemas.microsoft.com/office/word/2010/wordprocessingGroup" xmlns:wps="http://schemas.microsoft.com/office/word/2010/wordprocessingShape" mc:Ignorable="w14 w15 w16se w16cid w16 w16cex w16sdtdh wp14">
   <w:body>
     <w:p>
       <w:pPr>
         <w:pStyle w:val="Ttulo"/>
         <w:spacing w:before="200"/>
-        <w:ind w:left="0" w:firstLine="0"/>
+        <w:ind w:left="0"/>
         <w:jc w:val="center"/>
         <w:rPr>
-          <w:rFonts w:ascii="Bebas Neue" w:eastAsia="Bebas Neue" w:hAnsi="Bebas Neue" w:cs="Bebas Neue"/>
+          <w:rFonts w:ascii="Bebas Neue" w:hAnsi="Bebas Neue" w:eastAsia="Bebas Neue" w:cs="Bebas Neue"/>
           <w:sz w:val="48"/>
           <w:szCs w:val="48"/>
         </w:rPr>
       </w:pPr>
-      <w:bookmarkStart w:id="0" w:name="_eozjwa5ht1s6" w:colFirst="0" w:colLast="0"/>
-      <w:bookmarkEnd w:id="0"/>
+      <w:bookmarkStart w:id="0" w:name="_eozjwa5ht1s6"/>
       <w:r>
         <w:rPr>
-          <w:rFonts w:ascii="Bebas Neue" w:eastAsia="Bebas Neue" w:hAnsi="Bebas Neue" w:cs="Bebas Neue"/>
+          <w:rFonts w:ascii="Bebas Neue" w:hAnsi="Bebas Neue" w:eastAsia="Bebas Neue" w:cs="Bebas Neue"/>
           <w:sz w:val="48"/>
           <w:szCs w:val="48"/>
         </w:rPr>
         <w:t>Cartões CRC</w:t>
       </w:r>
+      <w:bookmarkEnd w:id="0"/>
     </w:p>
     <w:p>
       <w:pPr>
@@ -31,35 +31,91 @@
         <w:spacing w:before="200" w:after="0" w:line="276" w:lineRule="auto"/>
         <w:jc w:val="center"/>
         <w:rPr>
-          <w:rFonts w:ascii="Bebas Neue" w:eastAsia="Bebas Neue" w:hAnsi="Bebas Neue" w:cs="Bebas Neue"/>
+          <w:rFonts w:ascii="Bebas Neue" w:hAnsi="Bebas Neue" w:eastAsia="Bebas Neue" w:cs="Bebas Neue"/>
           <w:sz w:val="48"/>
           <w:szCs w:val="48"/>
         </w:rPr>
       </w:pPr>
-      <w:bookmarkStart w:id="1" w:name="_43j02cmavc8t" w:colFirst="0" w:colLast="0"/>
+      <w:bookmarkStart w:id="1" w:name="_43j02cmavc8t"/>
       <w:bookmarkEnd w:id="1"/>
     </w:p>
-    <w:p/>
-    <w:p/>
-    <w:p/>
-    <w:p/>
-    <w:p/>
-    <w:p/>
-    <w:p/>
-    <w:p/>
     <w:p>
       <w:pPr>
-        <w:pStyle w:val="Subttulo"/>
-      </w:pPr>
-      <w:bookmarkStart w:id="2" w:name="_3pkfyajrliq1" w:colFirst="0" w:colLast="0"/>
-      <w:bookmarkEnd w:id="2"/>
-      <w:r>
-        <w:t xml:space="preserve">Sistema de Informação Hospitalar</w:t>
-      </w:r>
+        <w:spacing w:line="360" w:lineRule="auto"/>
+        <w:ind w:left="1440" w:firstLine="720"/>
+        <w:jc w:val="both"/>
+      </w:pPr>
     </w:p>
     <w:p>
       <w:pPr>
+        <w:spacing w:line="360" w:lineRule="auto"/>
+        <w:ind w:left="1440" w:firstLine="720"/>
+        <w:jc w:val="both"/>
+      </w:pPr>
+    </w:p>
+    <w:p>
+      <w:pPr>
+        <w:spacing w:line="360" w:lineRule="auto"/>
+        <w:ind w:left="1440" w:firstLine="720"/>
+        <w:jc w:val="both"/>
+      </w:pPr>
+    </w:p>
+    <w:p>
+      <w:pPr>
+        <w:spacing w:line="360" w:lineRule="auto"/>
+        <w:ind w:left="1440" w:firstLine="720"/>
+        <w:jc w:val="both"/>
+      </w:pPr>
+    </w:p>
+    <w:p>
+      <w:pPr>
+        <w:spacing w:line="360" w:lineRule="auto"/>
+        <w:ind w:left="1440" w:firstLine="720"/>
+        <w:jc w:val="both"/>
+      </w:pPr>
+    </w:p>
+    <w:p>
+      <w:pPr>
+        <w:spacing w:line="360" w:lineRule="auto"/>
+        <w:ind w:left="1440" w:firstLine="720"/>
+        <w:jc w:val="both"/>
+      </w:pPr>
+    </w:p>
+    <w:p>
+      <w:pPr>
+        <w:spacing w:line="360" w:lineRule="auto"/>
+        <w:ind w:left="1440" w:firstLine="720"/>
+        <w:jc w:val="both"/>
+      </w:pPr>
+    </w:p>
+    <w:p>
+      <w:pPr>
+        <w:spacing w:line="360" w:lineRule="auto"/>
+        <w:ind w:left="1440" w:firstLine="720"/>
+        <w:jc w:val="both"/>
+      </w:pPr>
+    </w:p>
+    <w:p>
+      <w:pPr>
         <w:pStyle w:val="Subttulo"/>
+        <w:jc w:val="both"/>
+      </w:pPr>
+      <w:bookmarkStart w:id="2" w:name="_3pkfyajrliq1"/>
+      <w:r>
+        <w:rPr>
+          <w:rFonts w:ascii="Arial" w:hAnsi="Arial" w:eastAsia="Arial" w:cs="Arial"/>
+          <w:color w:val="666666"/>
+          <w:sz w:val="30"/>
+          <w:szCs w:val="30"/>
+        </w:rPr>
+        <w:t>Sistema de Informação Hospitalar</w:t>
+      </w:r>
+      <w:bookmarkEnd w:id="2"/>
+    </w:p>
+    <w:p>
+      <w:pPr>
+        <w:pStyle w:val="Subttulo"/>
+        <w:jc w:val="both"/>
         <w:rPr>
           <w:sz w:val="24"/>
           <w:szCs w:val="24"/>
@@ -67,55 +123,134 @@
       </w:pPr>
       <w:r>
         <w:rPr>
+          <w:rFonts w:ascii="Arial" w:hAnsi="Arial" w:eastAsia="Arial" w:cs="Arial"/>
+          <w:color w:val="666666"/>
           <w:sz w:val="24"/>
           <w:szCs w:val="24"/>
         </w:rPr>
-        <w:t xml:space="preserve">Trabalho Prático – Programação Modular</w:t>
+        <w:t>Trabalho Prático – Programação Modular</w:t>
       </w:r>
     </w:p>
     <w:p>
       <w:pPr>
-        <w:ind w:left="0" w:firstLine="0"/>
+        <w:ind w:left="0"/>
+        <w:jc w:val="both"/>
       </w:pPr>
     </w:p>
-    <w:p/>
-    <w:p/>
-    <w:p/>
-    <w:p/>
     <w:p>
       <w:pPr>
+        <w:spacing w:line="360" w:lineRule="auto"/>
+        <w:ind w:left="1440" w:firstLine="720"/>
+        <w:jc w:val="both"/>
+      </w:pPr>
+    </w:p>
+    <w:p>
+      <w:pPr>
+        <w:spacing w:line="360" w:lineRule="auto"/>
+        <w:ind w:left="1440" w:firstLine="720"/>
+        <w:jc w:val="both"/>
+      </w:pPr>
+    </w:p>
+    <w:p>
+      <w:pPr>
+        <w:spacing w:line="360" w:lineRule="auto"/>
+        <w:ind w:left="1440" w:firstLine="720"/>
+        <w:jc w:val="both"/>
+      </w:pPr>
+    </w:p>
+    <w:p>
+      <w:pPr>
+        <w:spacing w:line="360" w:lineRule="auto"/>
+        <w:ind w:left="1440" w:firstLine="720"/>
+        <w:jc w:val="both"/>
+      </w:pPr>
+    </w:p>
+    <w:p>
+      <w:pPr>
         <w:jc w:val="right"/>
       </w:pPr>
       <w:r>
+        <w:rPr>
+          <w:rFonts w:ascii="Open Sans" w:hAnsi="Open Sans" w:eastAsia="Open Sans" w:cs="Open Sans"/>
+        </w:rPr>
         <w:t>Luis Fernando de Sousa Dias</w:t>
-        <w:br/>
+      </w:r>
+      <w:r>
+        <w:br w:type="textWrapping"/>
+      </w:r>
+      <w:r>
+        <w:rPr>
+          <w:rFonts w:ascii="Open Sans" w:hAnsi="Open Sans" w:eastAsia="Open Sans" w:cs="Open Sans"/>
+        </w:rPr>
         <w:t>Erick Calixto</w:t>
-        <w:br/>
-        <w:t>Pedro Arthur</w:t>
+      </w:r>
+      <w:r>
+        <w:br w:type="textWrapping"/>
+      </w:r>
+      <w:r>
+        <w:rPr>
+          <w:rFonts w:ascii="Open Sans" w:hAnsi="Open Sans" w:eastAsia="Open Sans" w:cs="Open Sans"/>
+        </w:rPr>
+        <w:t>Pedro Arthur de Sena Ribeiro</w:t>
       </w:r>
     </w:p>
     <w:p>
       <w:pPr>
-        <w:ind w:left="0" w:firstLine="0"/>
+        <w:ind w:left="0"/>
+        <w:jc w:val="both"/>
       </w:pPr>
     </w:p>
-    <w:p/>
-    <w:p/>
-    <w:p/>
-    <w:p/>
-    <w:p/>
-    <w:p/>
     <w:p>
       <w:pPr>
-        <w:ind w:left="0" w:firstLine="0"/>
+        <w:spacing w:line="360" w:lineRule="auto"/>
+        <w:ind w:left="1440" w:firstLine="720"/>
+        <w:jc w:val="both"/>
+      </w:pPr>
+    </w:p>
+    <w:p>
+      <w:pPr>
+        <w:spacing w:line="360" w:lineRule="auto"/>
+        <w:ind w:left="1440" w:firstLine="720"/>
+        <w:jc w:val="both"/>
+      </w:pPr>
+    </w:p>
+    <w:p>
+      <w:pPr>
+        <w:spacing w:line="360" w:lineRule="auto"/>
+        <w:ind w:left="1440" w:firstLine="720"/>
+        <w:jc w:val="both"/>
+      </w:pPr>
+    </w:p>
+    <w:p>
+      <w:pPr>
+        <w:spacing w:line="360" w:lineRule="auto"/>
+        <w:ind w:left="1440" w:firstLine="720"/>
+        <w:jc w:val="both"/>
+      </w:pPr>
+    </w:p>
+    <w:p>
+      <w:pPr>
+        <w:spacing w:line="360" w:lineRule="auto"/>
+        <w:ind w:left="1440" w:firstLine="720"/>
+        <w:jc w:val="both"/>
+      </w:pPr>
+    </w:p>
+    <w:p>
+      <w:pPr>
+        <w:spacing w:line="360" w:lineRule="auto"/>
+        <w:ind w:left="1440" w:firstLine="720"/>
+        <w:jc w:val="both"/>
+      </w:pPr>
+    </w:p>
+    <w:p>
+      <w:pPr>
+        <w:ind w:left="0"/>
         <w:jc w:val="center"/>
         <w:sectPr>
           <w:headerReference w:type="default" r:id="rId7"/>
           <w:footerReference w:type="default" r:id="rId8"/>
           <w:pgSz w:w="11909" w:h="16834"/>
           <w:pgMar w:top="1440" w:right="1440" w:bottom="1440" w:left="1440" w:header="720" w:footer="720" w:gutter="0"/>
-          <w:pgNumType w:start="1"/>
-          <w:cols w:space="720"/>
           <w:titlePg/>
         </w:sectPr>
       </w:pPr>
@@ -127,38 +262,49 @@
           <w:ilvl w:val="0"/>
           <w:numId w:val="9"/>
         </w:numPr>
+        <w:ind w:left="720" w:hanging="360"/>
+        <w:jc w:val="both"/>
         <w:rPr>
           <w:sz w:val="36"/>
           <w:szCs w:val="36"/>
         </w:rPr>
       </w:pPr>
-      <w:bookmarkStart w:id="3" w:name="_hqvcsl1ejfi0" w:colFirst="0" w:colLast="0"/>
-      <w:bookmarkEnd w:id="3"/>
+      <w:bookmarkStart w:id="3" w:name="_hqvcsl1ejfi0"/>
       <w:r>
+        <w:lastRenderedPageBreak/>
         <w:rPr>
+          <w:rFonts w:ascii="Roboto" w:hAnsi="Roboto" w:eastAsia="Roboto" w:cs="Roboto"/>
           <w:sz w:val="36"/>
           <w:szCs w:val="36"/>
         </w:rPr>
-        <w:lastRenderedPageBreak/>
         <w:t>Cartões CRC</w:t>
       </w:r>
+      <w:bookmarkEnd w:id="3"/>
     </w:p>
     <w:p>
       <w:pPr>
         <w:spacing w:before="240" w:after="240"/>
-        <w:ind w:left="720" w:firstLine="0"/>
+        <w:ind w:left="720"/>
+        <w:jc w:val="both"/>
       </w:pPr>
       <w:r>
+        <w:rPr>
+          <w:rFonts w:ascii="Open Sans" w:hAnsi="Open Sans" w:eastAsia="Open Sans" w:cs="Open Sans"/>
+        </w:rPr>
         <w:t xml:space="preserve">Os </w:t>
       </w:r>
       <w:r>
         <w:rPr>
+          <w:rFonts w:ascii="Open Sans" w:hAnsi="Open Sans" w:eastAsia="Open Sans" w:cs="Open Sans"/>
           <w:b/>
           <w:bCs/>
         </w:rPr>
         <w:t>cartões CRC (Classe – Responsabilidade – Colaboração)</w:t>
       </w:r>
       <w:r>
+        <w:rPr>
+          <w:rFonts w:ascii="Open Sans" w:hAnsi="Open Sans" w:eastAsia="Open Sans" w:cs="Open Sans"/>
+        </w:rPr>
         <w:t xml:space="preserve"> são uma técnica utilizada no processo de modelagem orientada a objetos. Eles ajudam a representar de forma simples e visual as principais responsabilidades de uma classe e como ela se relaciona com outras classes dentro de um sistema.</w:t>
       </w:r>
     </w:p>
@@ -169,17 +315,21 @@
           <w:numId w:val="3"/>
         </w:numPr>
         <w:spacing w:before="240"/>
-        <w:ind w:firstLine="1080"/>
+        <w:ind w:left="720" w:firstLine="1080"/>
         <w:jc w:val="left"/>
       </w:pPr>
       <w:r>
         <w:rPr>
+          <w:rFonts w:ascii="Open Sans" w:hAnsi="Open Sans" w:eastAsia="Open Sans" w:cs="Open Sans"/>
           <w:b/>
           <w:bCs/>
         </w:rPr>
         <w:t>Classe</w:t>
       </w:r>
       <w:r>
+        <w:rPr>
+          <w:rFonts w:ascii="Open Sans" w:hAnsi="Open Sans" w:eastAsia="Open Sans" w:cs="Open Sans"/>
+        </w:rPr>
         <w:t>: define o nome da entidade e seu papel no sistema.</w:t>
       </w:r>
     </w:p>
@@ -189,17 +339,21 @@
           <w:ilvl w:val="0"/>
           <w:numId w:val="3"/>
         </w:numPr>
-        <w:ind w:firstLine="1080"/>
+        <w:ind w:left="720" w:firstLine="1080"/>
         <w:jc w:val="left"/>
       </w:pPr>
       <w:r>
         <w:rPr>
+          <w:rFonts w:ascii="Open Sans" w:hAnsi="Open Sans" w:eastAsia="Open Sans" w:cs="Open Sans"/>
           <w:b/>
           <w:bCs/>
         </w:rPr>
         <w:t>Responsabilidade</w:t>
       </w:r>
       <w:r>
+        <w:rPr>
+          <w:rFonts w:ascii="Open Sans" w:hAnsi="Open Sans" w:eastAsia="Open Sans" w:cs="Open Sans"/>
+        </w:rPr>
         <w:t>: descreve as funções ou comportamentos que a classe deve executar.</w:t>
       </w:r>
     </w:p>
@@ -210,17 +364,21 @@
           <w:numId w:val="3"/>
         </w:numPr>
         <w:spacing w:after="240"/>
-        <w:ind w:firstLine="1080"/>
+        <w:ind w:left="720" w:firstLine="1080"/>
         <w:jc w:val="left"/>
       </w:pPr>
       <w:r>
         <w:rPr>
+          <w:rFonts w:ascii="Open Sans" w:hAnsi="Open Sans" w:eastAsia="Open Sans" w:cs="Open Sans"/>
           <w:b/>
           <w:bCs/>
         </w:rPr>
         <w:t>Colaboração</w:t>
       </w:r>
       <w:r>
+        <w:rPr>
+          <w:rFonts w:ascii="Open Sans" w:hAnsi="Open Sans" w:eastAsia="Open Sans" w:cs="Open Sans"/>
+        </w:rPr>
         <w:t>: indica com quais outras classes a classe em questão precisa interagir para cumprir suas responsabilidades.</w:t>
       </w:r>
     </w:p>
@@ -228,8 +386,12 @@
       <w:pPr>
         <w:spacing w:before="240"/>
         <w:ind w:left="720"/>
+        <w:jc w:val="both"/>
       </w:pPr>
       <w:r>
+        <w:rPr>
+          <w:rFonts w:ascii="Open Sans" w:hAnsi="Open Sans" w:eastAsia="Open Sans" w:cs="Open Sans"/>
+        </w:rPr>
         <w:t>O uso dos cartões CRC favorece a compreensão coletiva do sistema, a comunicação entre os membros da equipe e o raciocínio sobre a distribuição adequada das responsabilidades. Além disso, eles estimulam a identificação de dependências entre classes e evitam a concentração excessiva de funções em uma única classe.</w:t>
       </w:r>
     </w:p>
@@ -237,8 +399,12 @@
       <w:pPr>
         <w:spacing w:after="240"/>
         <w:ind w:left="720"/>
+        <w:jc w:val="both"/>
       </w:pPr>
       <w:r>
+        <w:rPr>
+          <w:rFonts w:ascii="Open Sans" w:hAnsi="Open Sans" w:eastAsia="Open Sans" w:cs="Open Sans"/>
+        </w:rPr>
         <w:t>Nesta etapa do projeto, cada grupo deverá elaborar cartões CRC para representar partes específicas do sistema em estudo. O objetivo é exercitar a análise de responsabilidades e colaborações, consolidando a visão orientada a objetos de forma prática e colaborativa.</w:t>
       </w:r>
     </w:p>
@@ -249,8 +415,15 @@
           <w:ilvl w:val="1"/>
           <w:numId w:val="9"/>
         </w:numPr>
+        <w:ind w:left="1440" w:hanging="360"/>
+        <w:jc w:val="both"/>
       </w:pPr>
       <w:r>
+        <w:rPr>
+          <w:rFonts w:ascii="Roboto Light" w:hAnsi="Roboto Light" w:eastAsia="Roboto Light" w:cs="Roboto Light"/>
+          <w:sz w:val="28"/>
+          <w:szCs w:val="28"/>
+        </w:rPr>
         <w:t>Cartões CRC - Caso de Uso: Gerenciar Pacientes e Profissionais da Saúde</w:t>
       </w:r>
     </w:p>
@@ -268,7 +441,13 @@
           <w:insideV w:val="single" w:sz="8" w:space="0" w:color="000000"/>
         </w:tblBorders>
         <w:tblLayout w:type="fixed"/>
-        <w:tblLook w:val="0600" w:firstRow="0" w:lastRow="0" w:firstColumn="0" w:lastColumn="0" w:noHBand="1" w:noVBand="1"/>
+        <w:tblCellMar>
+          <w:top w:w="100" w:type="dxa"/>
+          <w:left w:w="100" w:type="dxa"/>
+          <w:bottom w:w="100" w:type="dxa"/>
+          <w:right w:w="100" w:type="dxa"/>
+        </w:tblCellMar>
+        <w:tblLook w:noHBand="1" w:noVBand="1"/>
       </w:tblPr>
       <w:tblGrid>
         <w:gridCol w:w="4960"/>
@@ -283,6 +462,12 @@
           <w:tcPr>
             <w:tcW w:w="7560" w:type="dxa"/>
             <w:gridSpan w:val="2"/>
+            <w:tcBorders>
+              <w:top w:val="single" w:sz="8" w:space="0" w:color="000000"/>
+              <w:left w:val="single" w:sz="8" w:space="0" w:color="000000"/>
+              <w:bottom w:val="single" w:sz="8" w:space="0" w:color="000000"/>
+              <w:right w:val="single" w:sz="8" w:space="0" w:color="000000"/>
+            </w:tcBorders>
             <w:tcMar>
               <w:top w:w="100" w:type="dxa"/>
               <w:left w:w="100" w:type="dxa"/>
@@ -295,15 +480,16 @@
               <w:keepNext/>
               <w:widowControl w:val="0"/>
               <w:spacing w:line="240" w:lineRule="auto"/>
-              <w:ind w:left="0" w:firstLine="0"/>
-              <w:jc w:val="left"/>
-              <w:rPr>
-                <w:b/>
-                <w:bCs/>
-              </w:rPr>
-            </w:pPr>
-            <w:r>
-              <w:rPr>
+              <w:ind w:left="0"/>
+              <w:jc w:val="left"/>
+              <w:rPr>
+                <w:b/>
+                <w:bCs/>
+              </w:rPr>
+            </w:pPr>
+            <w:r>
+              <w:rPr>
+                <w:rFonts w:ascii="Open Sans" w:hAnsi="Open Sans" w:eastAsia="Open Sans" w:cs="Open Sans"/>
                 <w:b/>
                 <w:bCs/>
               </w:rPr>
@@ -319,6 +505,12 @@
         <w:tc>
           <w:tcPr>
             <w:tcW w:w="4960" w:type="dxa"/>
+            <w:tcBorders>
+              <w:top w:val="single" w:sz="8" w:space="0" w:color="000000"/>
+              <w:left w:val="single" w:sz="8" w:space="0" w:color="000000"/>
+              <w:bottom w:val="single" w:sz="8" w:space="0" w:color="000000"/>
+              <w:right w:val="single" w:sz="8" w:space="0" w:color="000000"/>
+            </w:tcBorders>
             <w:tcMar>
               <w:top w:w="100" w:type="dxa"/>
               <w:left w:w="100" w:type="dxa"/>
@@ -331,15 +523,16 @@
               <w:keepNext/>
               <w:widowControl w:val="0"/>
               <w:spacing w:line="240" w:lineRule="auto"/>
-              <w:ind w:left="0" w:firstLine="0"/>
-              <w:jc w:val="left"/>
-              <w:rPr>
-                <w:b/>
-                <w:bCs/>
-              </w:rPr>
-            </w:pPr>
-            <w:r>
-              <w:rPr>
+              <w:ind w:left="0"/>
+              <w:jc w:val="left"/>
+              <w:rPr>
+                <w:b/>
+                <w:bCs/>
+              </w:rPr>
+            </w:pPr>
+            <w:r>
+              <w:rPr>
+                <w:rFonts w:ascii="Open Sans" w:hAnsi="Open Sans" w:eastAsia="Open Sans" w:cs="Open Sans"/>
                 <w:b/>
                 <w:bCs/>
               </w:rPr>
@@ -350,6 +543,12 @@
         <w:tc>
           <w:tcPr>
             <w:tcW w:w="2600" w:type="dxa"/>
+            <w:tcBorders>
+              <w:top w:val="single" w:sz="8" w:space="0" w:color="000000"/>
+              <w:left w:val="single" w:sz="8" w:space="0" w:color="000000"/>
+              <w:bottom w:val="single" w:sz="8" w:space="0" w:color="000000"/>
+              <w:right w:val="single" w:sz="8" w:space="0" w:color="000000"/>
+            </w:tcBorders>
             <w:tcMar>
               <w:top w:w="100" w:type="dxa"/>
               <w:left w:w="100" w:type="dxa"/>
@@ -362,15 +561,16 @@
               <w:keepNext/>
               <w:widowControl w:val="0"/>
               <w:spacing w:line="240" w:lineRule="auto"/>
-              <w:ind w:left="0" w:firstLine="0"/>
-              <w:jc w:val="left"/>
-              <w:rPr>
-                <w:b/>
-                <w:bCs/>
-              </w:rPr>
-            </w:pPr>
-            <w:r>
-              <w:rPr>
+              <w:ind w:left="0"/>
+              <w:jc w:val="left"/>
+              <w:rPr>
+                <w:b/>
+                <w:bCs/>
+              </w:rPr>
+            </w:pPr>
+            <w:r>
+              <w:rPr>
+                <w:rFonts w:ascii="Open Sans" w:hAnsi="Open Sans" w:eastAsia="Open Sans" w:cs="Open Sans"/>
                 <w:b/>
                 <w:bCs/>
               </w:rPr>
@@ -386,6 +586,12 @@
         <w:tc>
           <w:tcPr>
             <w:tcW w:w="4960" w:type="dxa"/>
+            <w:tcBorders>
+              <w:top w:val="single" w:sz="8" w:space="0" w:color="000000"/>
+              <w:left w:val="single" w:sz="8" w:space="0" w:color="000000"/>
+              <w:bottom w:val="single" w:sz="8" w:space="0" w:color="000000"/>
+              <w:right w:val="single" w:sz="8" w:space="0" w:color="000000"/>
+            </w:tcBorders>
             <w:tcMar>
               <w:top w:w="100" w:type="dxa"/>
               <w:left w:w="100" w:type="dxa"/>
@@ -401,9 +607,13 @@
                 <w:numId w:val="100"/>
               </w:numPr>
               <w:spacing w:line="240" w:lineRule="auto"/>
-              <w:jc w:val="left"/>
-            </w:pPr>
-            <w:r>
+              <w:ind w:left="720" w:hanging="360"/>
+              <w:jc w:val="left"/>
+            </w:pPr>
+            <w:r>
+              <w:rPr>
+                <w:rFonts w:ascii="Open Sans" w:hAnsi="Open Sans" w:eastAsia="Open Sans" w:cs="Open Sans"/>
+              </w:rPr>
               <w:t>Conhecer seu identificador</w:t>
             </w:r>
           </w:p>
@@ -415,9 +625,13 @@
                 <w:numId w:val="100"/>
               </w:numPr>
               <w:spacing w:line="240" w:lineRule="auto"/>
-              <w:jc w:val="left"/>
-            </w:pPr>
-            <w:r>
+              <w:ind w:left="720" w:hanging="360"/>
+              <w:jc w:val="left"/>
+            </w:pPr>
+            <w:r>
+              <w:rPr>
+                <w:rFonts w:ascii="Open Sans" w:hAnsi="Open Sans" w:eastAsia="Open Sans" w:cs="Open Sans"/>
+              </w:rPr>
               <w:t>Conhecer seu nome</w:t>
             </w:r>
           </w:p>
@@ -429,9 +643,13 @@
                 <w:numId w:val="100"/>
               </w:numPr>
               <w:spacing w:line="240" w:lineRule="auto"/>
-              <w:jc w:val="left"/>
-            </w:pPr>
-            <w:r>
+              <w:ind w:left="720" w:hanging="360"/>
+              <w:jc w:val="left"/>
+            </w:pPr>
+            <w:r>
+              <w:rPr>
+                <w:rFonts w:ascii="Open Sans" w:hAnsi="Open Sans" w:eastAsia="Open Sans" w:cs="Open Sans"/>
+              </w:rPr>
               <w:t>Conhecer seu telefone</w:t>
             </w:r>
           </w:p>
@@ -443,9 +661,13 @@
                 <w:numId w:val="100"/>
               </w:numPr>
               <w:spacing w:line="240" w:lineRule="auto"/>
-              <w:jc w:val="left"/>
-            </w:pPr>
-            <w:r>
+              <w:ind w:left="720" w:hanging="360"/>
+              <w:jc w:val="left"/>
+            </w:pPr>
+            <w:r>
+              <w:rPr>
+                <w:rFonts w:ascii="Open Sans" w:hAnsi="Open Sans" w:eastAsia="Open Sans" w:cs="Open Sans"/>
+              </w:rPr>
               <w:t>Conhecer seu e-mail de contato</w:t>
             </w:r>
           </w:p>
@@ -453,6 +675,12 @@
         <w:tc>
           <w:tcPr>
             <w:tcW w:w="2600" w:type="dxa"/>
+            <w:tcBorders>
+              <w:top w:val="single" w:sz="8" w:space="0" w:color="000000"/>
+              <w:left w:val="single" w:sz="8" w:space="0" w:color="000000"/>
+              <w:bottom w:val="single" w:sz="8" w:space="0" w:color="000000"/>
+              <w:right w:val="single" w:sz="8" w:space="0" w:color="000000"/>
+            </w:tcBorders>
             <w:tcMar>
               <w:top w:w="100" w:type="dxa"/>
               <w:left w:w="100" w:type="dxa"/>
@@ -464,10 +692,13 @@
             <w:pPr>
               <w:widowControl w:val="0"/>
               <w:spacing w:line="240" w:lineRule="auto"/>
-              <w:ind w:left="0" w:firstLine="0"/>
-              <w:jc w:val="left"/>
-            </w:pPr>
-            <w:r>
+              <w:ind w:left="0"/>
+              <w:jc w:val="left"/>
+            </w:pPr>
+            <w:r>
+              <w:rPr>
+                <w:rFonts w:ascii="Open Sans" w:hAnsi="Open Sans" w:eastAsia="Open Sans" w:cs="Open Sans"/>
+              </w:rPr>
               <w:t>—</w:t>
             </w:r>
           </w:p>
@@ -476,7 +707,8 @@
     </w:tbl>
     <w:p>
       <w:pPr>
-        <w:ind w:left="0" w:firstLine="0"/>
+        <w:ind w:left="0"/>
+        <w:jc w:val="both"/>
       </w:pPr>
     </w:p>
     <w:tbl>
@@ -493,7 +725,13 @@
           <w:insideV w:val="single" w:sz="8" w:space="0" w:color="000000"/>
         </w:tblBorders>
         <w:tblLayout w:type="fixed"/>
-        <w:tblLook w:val="0600" w:firstRow="0" w:lastRow="0" w:firstColumn="0" w:lastColumn="0" w:noHBand="1" w:noVBand="1"/>
+        <w:tblCellMar>
+          <w:top w:w="100" w:type="dxa"/>
+          <w:left w:w="100" w:type="dxa"/>
+          <w:bottom w:w="100" w:type="dxa"/>
+          <w:right w:w="100" w:type="dxa"/>
+        </w:tblCellMar>
+        <w:tblLook w:noHBand="1" w:noVBand="1"/>
       </w:tblPr>
       <w:tblGrid>
         <w:gridCol w:w="4960"/>
@@ -508,6 +746,12 @@
           <w:tcPr>
             <w:tcW w:w="7560" w:type="dxa"/>
             <w:gridSpan w:val="2"/>
+            <w:tcBorders>
+              <w:top w:val="single" w:sz="8" w:space="0" w:color="000000"/>
+              <w:left w:val="single" w:sz="8" w:space="0" w:color="000000"/>
+              <w:bottom w:val="single" w:sz="8" w:space="0" w:color="000000"/>
+              <w:right w:val="single" w:sz="8" w:space="0" w:color="000000"/>
+            </w:tcBorders>
             <w:tcMar>
               <w:top w:w="100" w:type="dxa"/>
               <w:left w:w="100" w:type="dxa"/>
@@ -520,15 +764,16 @@
               <w:keepNext/>
               <w:widowControl w:val="0"/>
               <w:spacing w:line="240" w:lineRule="auto"/>
-              <w:ind w:left="0" w:firstLine="0"/>
-              <w:jc w:val="left"/>
-              <w:rPr>
-                <w:b/>
-                <w:bCs/>
-              </w:rPr>
-            </w:pPr>
-            <w:r>
-              <w:rPr>
+              <w:ind w:left="0"/>
+              <w:jc w:val="left"/>
+              <w:rPr>
+                <w:b/>
+                <w:bCs/>
+              </w:rPr>
+            </w:pPr>
+            <w:r>
+              <w:rPr>
+                <w:rFonts w:ascii="Open Sans" w:hAnsi="Open Sans" w:eastAsia="Open Sans" w:cs="Open Sans"/>
                 <w:b/>
                 <w:bCs/>
               </w:rPr>
@@ -544,6 +789,12 @@
         <w:tc>
           <w:tcPr>
             <w:tcW w:w="4960" w:type="dxa"/>
+            <w:tcBorders>
+              <w:top w:val="single" w:sz="8" w:space="0" w:color="000000"/>
+              <w:left w:val="single" w:sz="8" w:space="0" w:color="000000"/>
+              <w:bottom w:val="single" w:sz="8" w:space="0" w:color="000000"/>
+              <w:right w:val="single" w:sz="8" w:space="0" w:color="000000"/>
+            </w:tcBorders>
             <w:tcMar>
               <w:top w:w="100" w:type="dxa"/>
               <w:left w:w="100" w:type="dxa"/>
@@ -556,15 +807,16 @@
               <w:keepNext/>
               <w:widowControl w:val="0"/>
               <w:spacing w:line="240" w:lineRule="auto"/>
-              <w:ind w:left="0" w:firstLine="0"/>
-              <w:jc w:val="left"/>
-              <w:rPr>
-                <w:b/>
-                <w:bCs/>
-              </w:rPr>
-            </w:pPr>
-            <w:r>
-              <w:rPr>
+              <w:ind w:left="0"/>
+              <w:jc w:val="left"/>
+              <w:rPr>
+                <w:b/>
+                <w:bCs/>
+              </w:rPr>
+            </w:pPr>
+            <w:r>
+              <w:rPr>
+                <w:rFonts w:ascii="Open Sans" w:hAnsi="Open Sans" w:eastAsia="Open Sans" w:cs="Open Sans"/>
                 <w:b/>
                 <w:bCs/>
               </w:rPr>
@@ -575,6 +827,12 @@
         <w:tc>
           <w:tcPr>
             <w:tcW w:w="2600" w:type="dxa"/>
+            <w:tcBorders>
+              <w:top w:val="single" w:sz="8" w:space="0" w:color="000000"/>
+              <w:left w:val="single" w:sz="8" w:space="0" w:color="000000"/>
+              <w:bottom w:val="single" w:sz="8" w:space="0" w:color="000000"/>
+              <w:right w:val="single" w:sz="8" w:space="0" w:color="000000"/>
+            </w:tcBorders>
             <w:tcMar>
               <w:top w:w="100" w:type="dxa"/>
               <w:left w:w="100" w:type="dxa"/>
@@ -587,15 +845,16 @@
               <w:keepNext/>
               <w:widowControl w:val="0"/>
               <w:spacing w:line="240" w:lineRule="auto"/>
-              <w:ind w:left="0" w:firstLine="0"/>
-              <w:jc w:val="left"/>
-              <w:rPr>
-                <w:b/>
-                <w:bCs/>
-              </w:rPr>
-            </w:pPr>
-            <w:r>
-              <w:rPr>
+              <w:ind w:left="0"/>
+              <w:jc w:val="left"/>
+              <w:rPr>
+                <w:b/>
+                <w:bCs/>
+              </w:rPr>
+            </w:pPr>
+            <w:r>
+              <w:rPr>
+                <w:rFonts w:ascii="Open Sans" w:hAnsi="Open Sans" w:eastAsia="Open Sans" w:cs="Open Sans"/>
                 <w:b/>
                 <w:bCs/>
               </w:rPr>
@@ -611,6 +870,12 @@
         <w:tc>
           <w:tcPr>
             <w:tcW w:w="4960" w:type="dxa"/>
+            <w:tcBorders>
+              <w:top w:val="single" w:sz="8" w:space="0" w:color="000000"/>
+              <w:left w:val="single" w:sz="8" w:space="0" w:color="000000"/>
+              <w:bottom w:val="single" w:sz="8" w:space="0" w:color="000000"/>
+              <w:right w:val="single" w:sz="8" w:space="0" w:color="000000"/>
+            </w:tcBorders>
             <w:tcMar>
               <w:top w:w="100" w:type="dxa"/>
               <w:left w:w="100" w:type="dxa"/>
@@ -626,9 +891,13 @@
                 <w:numId w:val="101"/>
               </w:numPr>
               <w:spacing w:line="240" w:lineRule="auto"/>
-              <w:jc w:val="left"/>
-            </w:pPr>
-            <w:r>
+              <w:ind w:left="720" w:hanging="360"/>
+              <w:jc w:val="left"/>
+            </w:pPr>
+            <w:r>
+              <w:rPr>
+                <w:rFonts w:ascii="Open Sans" w:hAnsi="Open Sans" w:eastAsia="Open Sans" w:cs="Open Sans"/>
+              </w:rPr>
               <w:t>Conhecer seu CPF</w:t>
             </w:r>
           </w:p>
@@ -640,9 +909,13 @@
                 <w:numId w:val="101"/>
               </w:numPr>
               <w:spacing w:line="240" w:lineRule="auto"/>
-              <w:jc w:val="left"/>
-            </w:pPr>
-            <w:r>
+              <w:ind w:left="720" w:hanging="360"/>
+              <w:jc w:val="left"/>
+            </w:pPr>
+            <w:r>
+              <w:rPr>
+                <w:rFonts w:ascii="Open Sans" w:hAnsi="Open Sans" w:eastAsia="Open Sans" w:cs="Open Sans"/>
+              </w:rPr>
               <w:t>Conhecer sua data de nascimento</w:t>
             </w:r>
           </w:p>
@@ -654,9 +927,13 @@
                 <w:numId w:val="101"/>
               </w:numPr>
               <w:spacing w:line="240" w:lineRule="auto"/>
-              <w:jc w:val="left"/>
-            </w:pPr>
-            <w:r>
+              <w:ind w:left="720" w:hanging="360"/>
+              <w:jc w:val="left"/>
+            </w:pPr>
+            <w:r>
+              <w:rPr>
+                <w:rFonts w:ascii="Open Sans" w:hAnsi="Open Sans" w:eastAsia="Open Sans" w:cs="Open Sans"/>
+              </w:rPr>
               <w:t>Conhecer seu endereço</w:t>
             </w:r>
           </w:p>
@@ -668,9 +945,13 @@
                 <w:numId w:val="101"/>
               </w:numPr>
               <w:spacing w:line="240" w:lineRule="auto"/>
-              <w:jc w:val="left"/>
-            </w:pPr>
-            <w:r>
+              <w:ind w:left="720" w:hanging="360"/>
+              <w:jc w:val="left"/>
+            </w:pPr>
+            <w:r>
+              <w:rPr>
+                <w:rFonts w:ascii="Open Sans" w:hAnsi="Open Sans" w:eastAsia="Open Sans" w:cs="Open Sans"/>
+              </w:rPr>
               <w:t>Conhecer seu histórico médico</w:t>
             </w:r>
           </w:p>
@@ -682,44 +963,26 @@
                 <w:numId w:val="101"/>
               </w:numPr>
               <w:spacing w:line="240" w:lineRule="auto"/>
-              <w:jc w:val="left"/>
-            </w:pPr>
-            <w:r>
+              <w:ind w:left="720" w:hanging="360"/>
+              <w:jc w:val="left"/>
+            </w:pPr>
+            <w:r>
+              <w:rPr>
+                <w:rFonts w:ascii="Open Sans" w:hAnsi="Open Sans" w:eastAsia="Open Sans" w:cs="Open Sans"/>
+              </w:rPr>
               <w:t>Calcular sua idade</w:t>
-            </w:r>
-          </w:p>
-          <w:p>
-            <w:pPr>
-              <w:widowControl w:val="0"/>
-              <w:numPr>
-                <w:ilvl w:val="0"/>
-                <w:numId w:val="101"/>
-              </w:numPr>
-              <w:spacing w:line="240" w:lineRule="auto"/>
-              <w:jc w:val="left"/>
-            </w:pPr>
-            <w:r>
-              <w:t>Validar a unicidade de seu CPF</w:t>
-            </w:r>
-          </w:p>
-          <w:p>
-            <w:pPr>
-              <w:widowControl w:val="0"/>
-              <w:numPr>
-                <w:ilvl w:val="0"/>
-                <w:numId w:val="101"/>
-              </w:numPr>
-              <w:spacing w:line="240" w:lineRule="auto"/>
-              <w:jc w:val="left"/>
-            </w:pPr>
-            <w:r>
-              <w:t>Verificar se possui internação ativa</w:t>
             </w:r>
           </w:p>
         </w:tc>
         <w:tc>
           <w:tcPr>
             <w:tcW w:w="2600" w:type="dxa"/>
+            <w:tcBorders>
+              <w:top w:val="single" w:sz="8" w:space="0" w:color="000000"/>
+              <w:left w:val="single" w:sz="8" w:space="0" w:color="000000"/>
+              <w:bottom w:val="single" w:sz="8" w:space="0" w:color="000000"/>
+              <w:right w:val="single" w:sz="8" w:space="0" w:color="000000"/>
+            </w:tcBorders>
             <w:tcMar>
               <w:top w:w="100" w:type="dxa"/>
               <w:left w:w="100" w:type="dxa"/>
@@ -731,10 +994,13 @@
             <w:pPr>
               <w:widowControl w:val="0"/>
               <w:spacing w:line="240" w:lineRule="auto"/>
-              <w:ind w:left="0" w:firstLine="0"/>
-              <w:jc w:val="left"/>
-            </w:pPr>
-            <w:r>
+              <w:ind w:left="0"/>
+              <w:jc w:val="left"/>
+            </w:pPr>
+            <w:r>
+              <w:rPr>
+                <w:rFonts w:ascii="Open Sans" w:hAnsi="Open Sans" w:eastAsia="Open Sans" w:cs="Open Sans"/>
+              </w:rPr>
               <w:t>Pessoa</w:t>
             </w:r>
           </w:p>
@@ -742,10 +1008,13 @@
             <w:pPr>
               <w:widowControl w:val="0"/>
               <w:spacing w:line="240" w:lineRule="auto"/>
-              <w:ind w:left="0" w:firstLine="0"/>
-              <w:jc w:val="left"/>
-            </w:pPr>
-            <w:r>
+              <w:ind w:left="0"/>
+              <w:jc w:val="left"/>
+            </w:pPr>
+            <w:r>
+              <w:rPr>
+                <w:rFonts w:ascii="Open Sans" w:hAnsi="Open Sans" w:eastAsia="Open Sans" w:cs="Open Sans"/>
+              </w:rPr>
               <w:t>Endereço</w:t>
             </w:r>
           </w:p>
@@ -753,10 +1022,13 @@
             <w:pPr>
               <w:widowControl w:val="0"/>
               <w:spacing w:line="240" w:lineRule="auto"/>
-              <w:ind w:left="0" w:firstLine="0"/>
-              <w:jc w:val="left"/>
-            </w:pPr>
-            <w:r>
+              <w:ind w:left="0"/>
+              <w:jc w:val="left"/>
+            </w:pPr>
+            <w:r>
+              <w:rPr>
+                <w:rFonts w:ascii="Open Sans" w:hAnsi="Open Sans" w:eastAsia="Open Sans" w:cs="Open Sans"/>
+              </w:rPr>
               <w:t>Histórico Médico</w:t>
             </w:r>
           </w:p>
@@ -764,11 +1036,22 @@
             <w:pPr>
               <w:widowControl w:val="0"/>
               <w:spacing w:line="240" w:lineRule="auto"/>
-              <w:ind w:left="0" w:firstLine="0"/>
-              <w:jc w:val="left"/>
-            </w:pPr>
-            <w:r>
+              <w:ind w:left="0"/>
+              <w:jc w:val="left"/>
+            </w:pPr>
+            <w:r>
+              <w:rPr>
+                <w:rFonts w:ascii="Open Sans" w:hAnsi="Open Sans" w:eastAsia="Open Sans" w:cs="Open Sans"/>
+              </w:rPr>
               <w:t>Internação</w:t>
+            </w:r>
+          </w:p>
+          <w:p>
+            <w:pPr>
+              <w:spacing w:line="240" w:lineRule="auto"/>
+            </w:pPr>
+            <w:r>
+              <w:t>Consulta</w:t>
             </w:r>
           </w:p>
         </w:tc>
@@ -776,7 +1059,8 @@
     </w:tbl>
     <w:p>
       <w:pPr>
-        <w:ind w:left="0" w:firstLine="0"/>
+        <w:ind w:left="0"/>
+        <w:jc w:val="both"/>
       </w:pPr>
     </w:p>
     <w:tbl>
@@ -793,7 +1077,13 @@
           <w:insideV w:val="single" w:sz="8" w:space="0" w:color="000000"/>
         </w:tblBorders>
         <w:tblLayout w:type="fixed"/>
-        <w:tblLook w:val="0600" w:firstRow="0" w:lastRow="0" w:firstColumn="0" w:lastColumn="0" w:noHBand="1" w:noVBand="1"/>
+        <w:tblCellMar>
+          <w:top w:w="100" w:type="dxa"/>
+          <w:left w:w="100" w:type="dxa"/>
+          <w:bottom w:w="100" w:type="dxa"/>
+          <w:right w:w="100" w:type="dxa"/>
+        </w:tblCellMar>
+        <w:tblLook w:noHBand="1" w:noVBand="1"/>
       </w:tblPr>
       <w:tblGrid>
         <w:gridCol w:w="4960"/>
@@ -808,6 +1098,12 @@
           <w:tcPr>
             <w:tcW w:w="7560" w:type="dxa"/>
             <w:gridSpan w:val="2"/>
+            <w:tcBorders>
+              <w:top w:val="single" w:sz="8" w:space="0" w:color="000000"/>
+              <w:left w:val="single" w:sz="8" w:space="0" w:color="000000"/>
+              <w:bottom w:val="single" w:sz="8" w:space="0" w:color="000000"/>
+              <w:right w:val="single" w:sz="8" w:space="0" w:color="000000"/>
+            </w:tcBorders>
             <w:tcMar>
               <w:top w:w="100" w:type="dxa"/>
               <w:left w:w="100" w:type="dxa"/>
@@ -820,15 +1116,16 @@
               <w:keepNext/>
               <w:widowControl w:val="0"/>
               <w:spacing w:line="240" w:lineRule="auto"/>
-              <w:ind w:left="0" w:firstLine="0"/>
-              <w:jc w:val="left"/>
-              <w:rPr>
-                <w:b/>
-                <w:bCs/>
-              </w:rPr>
-            </w:pPr>
-            <w:r>
-              <w:rPr>
+              <w:ind w:left="0"/>
+              <w:jc w:val="left"/>
+              <w:rPr>
+                <w:b/>
+                <w:bCs/>
+              </w:rPr>
+            </w:pPr>
+            <w:r>
+              <w:rPr>
+                <w:rFonts w:ascii="Open Sans" w:hAnsi="Open Sans" w:eastAsia="Open Sans" w:cs="Open Sans"/>
                 <w:b/>
                 <w:bCs/>
               </w:rPr>
@@ -844,6 +1141,12 @@
         <w:tc>
           <w:tcPr>
             <w:tcW w:w="4960" w:type="dxa"/>
+            <w:tcBorders>
+              <w:top w:val="single" w:sz="8" w:space="0" w:color="000000"/>
+              <w:left w:val="single" w:sz="8" w:space="0" w:color="000000"/>
+              <w:bottom w:val="single" w:sz="8" w:space="0" w:color="000000"/>
+              <w:right w:val="single" w:sz="8" w:space="0" w:color="000000"/>
+            </w:tcBorders>
             <w:tcMar>
               <w:top w:w="100" w:type="dxa"/>
               <w:left w:w="100" w:type="dxa"/>
@@ -856,15 +1159,16 @@
               <w:keepNext/>
               <w:widowControl w:val="0"/>
               <w:spacing w:line="240" w:lineRule="auto"/>
-              <w:ind w:left="0" w:firstLine="0"/>
-              <w:jc w:val="left"/>
-              <w:rPr>
-                <w:b/>
-                <w:bCs/>
-              </w:rPr>
-            </w:pPr>
-            <w:r>
-              <w:rPr>
+              <w:ind w:left="0"/>
+              <w:jc w:val="left"/>
+              <w:rPr>
+                <w:b/>
+                <w:bCs/>
+              </w:rPr>
+            </w:pPr>
+            <w:r>
+              <w:rPr>
+                <w:rFonts w:ascii="Open Sans" w:hAnsi="Open Sans" w:eastAsia="Open Sans" w:cs="Open Sans"/>
                 <w:b/>
                 <w:bCs/>
               </w:rPr>
@@ -875,6 +1179,12 @@
         <w:tc>
           <w:tcPr>
             <w:tcW w:w="2600" w:type="dxa"/>
+            <w:tcBorders>
+              <w:top w:val="single" w:sz="8" w:space="0" w:color="000000"/>
+              <w:left w:val="single" w:sz="8" w:space="0" w:color="000000"/>
+              <w:bottom w:val="single" w:sz="8" w:space="0" w:color="000000"/>
+              <w:right w:val="single" w:sz="8" w:space="0" w:color="000000"/>
+            </w:tcBorders>
             <w:tcMar>
               <w:top w:w="100" w:type="dxa"/>
               <w:left w:w="100" w:type="dxa"/>
@@ -887,15 +1197,16 @@
               <w:keepNext/>
               <w:widowControl w:val="0"/>
               <w:spacing w:line="240" w:lineRule="auto"/>
-              <w:ind w:left="0" w:firstLine="0"/>
-              <w:jc w:val="left"/>
-              <w:rPr>
-                <w:b/>
-                <w:bCs/>
-              </w:rPr>
-            </w:pPr>
-            <w:r>
-              <w:rPr>
+              <w:ind w:left="0"/>
+              <w:jc w:val="left"/>
+              <w:rPr>
+                <w:b/>
+                <w:bCs/>
+              </w:rPr>
+            </w:pPr>
+            <w:r>
+              <w:rPr>
+                <w:rFonts w:ascii="Open Sans" w:hAnsi="Open Sans" w:eastAsia="Open Sans" w:cs="Open Sans"/>
                 <w:b/>
                 <w:bCs/>
               </w:rPr>
@@ -911,6 +1222,12 @@
         <w:tc>
           <w:tcPr>
             <w:tcW w:w="4960" w:type="dxa"/>
+            <w:tcBorders>
+              <w:top w:val="single" w:sz="8" w:space="0" w:color="000000"/>
+              <w:left w:val="single" w:sz="8" w:space="0" w:color="000000"/>
+              <w:bottom w:val="single" w:sz="8" w:space="0" w:color="000000"/>
+              <w:right w:val="single" w:sz="8" w:space="0" w:color="000000"/>
+            </w:tcBorders>
             <w:tcMar>
               <w:top w:w="100" w:type="dxa"/>
               <w:left w:w="100" w:type="dxa"/>
@@ -926,9 +1243,13 @@
                 <w:numId w:val="102"/>
               </w:numPr>
               <w:spacing w:line="240" w:lineRule="auto"/>
-              <w:jc w:val="left"/>
-            </w:pPr>
-            <w:r>
+              <w:ind w:left="720" w:hanging="360"/>
+              <w:jc w:val="left"/>
+            </w:pPr>
+            <w:r>
+              <w:rPr>
+                <w:rFonts w:ascii="Open Sans" w:hAnsi="Open Sans" w:eastAsia="Open Sans" w:cs="Open Sans"/>
+              </w:rPr>
               <w:t>Conhecer seu registro profissional</w:t>
             </w:r>
           </w:p>
@@ -940,9 +1261,13 @@
                 <w:numId w:val="102"/>
               </w:numPr>
               <w:spacing w:line="240" w:lineRule="auto"/>
-              <w:jc w:val="left"/>
-            </w:pPr>
-            <w:r>
+              <w:ind w:left="720" w:hanging="360"/>
+              <w:jc w:val="left"/>
+            </w:pPr>
+            <w:r>
+              <w:rPr>
+                <w:rFonts w:ascii="Open Sans" w:hAnsi="Open Sans" w:eastAsia="Open Sans" w:cs="Open Sans"/>
+              </w:rPr>
               <w:t>Conhecer sua especialidade</w:t>
             </w:r>
           </w:p>
@@ -954,10 +1279,14 @@
                 <w:numId w:val="102"/>
               </w:numPr>
               <w:spacing w:line="240" w:lineRule="auto"/>
-              <w:jc w:val="left"/>
-            </w:pPr>
-            <w:r>
-              <w:t>Validar a unicidade de seu registro profissional</w:t>
+              <w:ind w:left="720" w:hanging="360"/>
+              <w:jc w:val="left"/>
+            </w:pPr>
+            <w:r>
+              <w:rPr>
+                <w:rFonts w:ascii="Open Sans" w:hAnsi="Open Sans" w:eastAsia="Open Sans" w:cs="Open Sans"/>
+              </w:rPr>
+              <w:t>Conhecer seus horários de disponibilidade</w:t>
             </w:r>
           </w:p>
           <w:p>
@@ -968,10 +1297,14 @@
                 <w:numId w:val="102"/>
               </w:numPr>
               <w:spacing w:line="240" w:lineRule="auto"/>
-              <w:jc w:val="left"/>
-            </w:pPr>
-            <w:r>
-              <w:t>Conhecer seus horários de disponibilidade</w:t>
+              <w:ind w:left="720" w:hanging="360"/>
+              <w:jc w:val="left"/>
+            </w:pPr>
+            <w:r>
+              <w:rPr>
+                <w:rFonts w:ascii="Open Sans" w:hAnsi="Open Sans" w:eastAsia="Open Sans" w:cs="Open Sans"/>
+              </w:rPr>
+              <w:t>Verificar se está livre em uma data e horário</w:t>
             </w:r>
           </w:p>
           <w:p>
@@ -982,23 +1315,13 @@
                 <w:numId w:val="102"/>
               </w:numPr>
               <w:spacing w:line="240" w:lineRule="auto"/>
-              <w:jc w:val="left"/>
-            </w:pPr>
-            <w:r>
-              <w:t>Verificar se está livre em uma data e horário</w:t>
-            </w:r>
-          </w:p>
-          <w:p>
-            <w:pPr>
-              <w:widowControl w:val="0"/>
-              <w:numPr>
-                <w:ilvl w:val="0"/>
-                <w:numId w:val="102"/>
-              </w:numPr>
-              <w:spacing w:line="240" w:lineRule="auto"/>
-              <w:jc w:val="left"/>
-            </w:pPr>
-            <w:r>
+              <w:ind w:left="720" w:hanging="360"/>
+              <w:jc w:val="left"/>
+            </w:pPr>
+            <w:r>
+              <w:rPr>
+                <w:rFonts w:ascii="Open Sans" w:hAnsi="Open Sans" w:eastAsia="Open Sans" w:cs="Open Sans"/>
+              </w:rPr>
               <w:t>Verificar se já possui atendimento agendado no mesmo horário</w:t>
             </w:r>
           </w:p>
@@ -1006,6 +1329,12 @@
         <w:tc>
           <w:tcPr>
             <w:tcW w:w="2600" w:type="dxa"/>
+            <w:tcBorders>
+              <w:top w:val="single" w:sz="8" w:space="0" w:color="000000"/>
+              <w:left w:val="single" w:sz="8" w:space="0" w:color="000000"/>
+              <w:bottom w:val="single" w:sz="8" w:space="0" w:color="000000"/>
+              <w:right w:val="single" w:sz="8" w:space="0" w:color="000000"/>
+            </w:tcBorders>
             <w:tcMar>
               <w:top w:w="100" w:type="dxa"/>
               <w:left w:w="100" w:type="dxa"/>
@@ -1017,10 +1346,13 @@
             <w:pPr>
               <w:widowControl w:val="0"/>
               <w:spacing w:line="240" w:lineRule="auto"/>
-              <w:ind w:left="0" w:firstLine="0"/>
-              <w:jc w:val="left"/>
-            </w:pPr>
-            <w:r>
+              <w:ind w:left="0"/>
+              <w:jc w:val="left"/>
+            </w:pPr>
+            <w:r>
+              <w:rPr>
+                <w:rFonts w:ascii="Open Sans" w:hAnsi="Open Sans" w:eastAsia="Open Sans" w:cs="Open Sans"/>
+              </w:rPr>
               <w:t>Pessoa</w:t>
             </w:r>
           </w:p>
@@ -1028,10 +1360,13 @@
             <w:pPr>
               <w:widowControl w:val="0"/>
               <w:spacing w:line="240" w:lineRule="auto"/>
-              <w:ind w:left="0" w:firstLine="0"/>
-              <w:jc w:val="left"/>
-            </w:pPr>
-            <w:r>
+              <w:ind w:left="0"/>
+              <w:jc w:val="left"/>
+            </w:pPr>
+            <w:r>
+              <w:rPr>
+                <w:rFonts w:ascii="Open Sans" w:hAnsi="Open Sans" w:eastAsia="Open Sans" w:cs="Open Sans"/>
+              </w:rPr>
               <w:t>Disponibilidade</w:t>
             </w:r>
           </w:p>
@@ -1039,11 +1374,22 @@
             <w:pPr>
               <w:widowControl w:val="0"/>
               <w:spacing w:line="240" w:lineRule="auto"/>
-              <w:ind w:left="0" w:firstLine="0"/>
-              <w:jc w:val="left"/>
-            </w:pPr>
-            <w:r>
+              <w:ind w:left="0"/>
+              <w:jc w:val="left"/>
+            </w:pPr>
+            <w:r>
+              <w:rPr>
+                <w:rFonts w:ascii="Open Sans" w:hAnsi="Open Sans" w:eastAsia="Open Sans" w:cs="Open Sans"/>
+              </w:rPr>
               <w:t>Consulta</w:t>
+            </w:r>
+          </w:p>
+          <w:p>
+            <w:pPr>
+              <w:spacing w:line="240" w:lineRule="auto"/>
+            </w:pPr>
+            <w:r>
+              <w:t>Internação</w:t>
             </w:r>
           </w:p>
         </w:tc>
@@ -1051,7 +1397,8 @@
     </w:tbl>
     <w:p>
       <w:pPr>
-        <w:ind w:left="0" w:firstLine="0"/>
+        <w:ind w:left="0"/>
+        <w:jc w:val="both"/>
       </w:pPr>
     </w:p>
     <w:tbl>
@@ -1068,7 +1415,13 @@
           <w:insideV w:val="single" w:sz="8" w:space="0" w:color="000000"/>
         </w:tblBorders>
         <w:tblLayout w:type="fixed"/>
-        <w:tblLook w:val="0600" w:firstRow="0" w:lastRow="0" w:firstColumn="0" w:lastColumn="0" w:noHBand="1" w:noVBand="1"/>
+        <w:tblCellMar>
+          <w:top w:w="100" w:type="dxa"/>
+          <w:left w:w="100" w:type="dxa"/>
+          <w:bottom w:w="100" w:type="dxa"/>
+          <w:right w:w="100" w:type="dxa"/>
+        </w:tblCellMar>
+        <w:tblLook w:noHBand="1" w:noVBand="1"/>
       </w:tblPr>
       <w:tblGrid>
         <w:gridCol w:w="4960"/>
@@ -1083,6 +1436,12 @@
           <w:tcPr>
             <w:tcW w:w="7560" w:type="dxa"/>
             <w:gridSpan w:val="2"/>
+            <w:tcBorders>
+              <w:top w:val="single" w:sz="8" w:space="0" w:color="000000"/>
+              <w:left w:val="single" w:sz="8" w:space="0" w:color="000000"/>
+              <w:bottom w:val="single" w:sz="8" w:space="0" w:color="000000"/>
+              <w:right w:val="single" w:sz="8" w:space="0" w:color="000000"/>
+            </w:tcBorders>
             <w:tcMar>
               <w:top w:w="100" w:type="dxa"/>
               <w:left w:w="100" w:type="dxa"/>
@@ -1095,15 +1454,16 @@
               <w:keepNext/>
               <w:widowControl w:val="0"/>
               <w:spacing w:line="240" w:lineRule="auto"/>
-              <w:ind w:left="0" w:firstLine="0"/>
-              <w:jc w:val="left"/>
-              <w:rPr>
-                <w:b/>
-                <w:bCs/>
-              </w:rPr>
-            </w:pPr>
-            <w:r>
-              <w:rPr>
+              <w:ind w:left="0"/>
+              <w:jc w:val="left"/>
+              <w:rPr>
+                <w:b/>
+                <w:bCs/>
+              </w:rPr>
+            </w:pPr>
+            <w:r>
+              <w:rPr>
+                <w:rFonts w:ascii="Open Sans" w:hAnsi="Open Sans" w:eastAsia="Open Sans" w:cs="Open Sans"/>
                 <w:b/>
                 <w:bCs/>
               </w:rPr>
@@ -1119,6 +1479,12 @@
         <w:tc>
           <w:tcPr>
             <w:tcW w:w="4960" w:type="dxa"/>
+            <w:tcBorders>
+              <w:top w:val="single" w:sz="8" w:space="0" w:color="000000"/>
+              <w:left w:val="single" w:sz="8" w:space="0" w:color="000000"/>
+              <w:bottom w:val="single" w:sz="8" w:space="0" w:color="000000"/>
+              <w:right w:val="single" w:sz="8" w:space="0" w:color="000000"/>
+            </w:tcBorders>
             <w:tcMar>
               <w:top w:w="100" w:type="dxa"/>
               <w:left w:w="100" w:type="dxa"/>
@@ -1131,15 +1497,16 @@
               <w:keepNext/>
               <w:widowControl w:val="0"/>
               <w:spacing w:line="240" w:lineRule="auto"/>
-              <w:ind w:left="0" w:firstLine="0"/>
-              <w:jc w:val="left"/>
-              <w:rPr>
-                <w:b/>
-                <w:bCs/>
-              </w:rPr>
-            </w:pPr>
-            <w:r>
-              <w:rPr>
+              <w:ind w:left="0"/>
+              <w:jc w:val="left"/>
+              <w:rPr>
+                <w:b/>
+                <w:bCs/>
+              </w:rPr>
+            </w:pPr>
+            <w:r>
+              <w:rPr>
+                <w:rFonts w:ascii="Open Sans" w:hAnsi="Open Sans" w:eastAsia="Open Sans" w:cs="Open Sans"/>
                 <w:b/>
                 <w:bCs/>
               </w:rPr>
@@ -1150,6 +1517,12 @@
         <w:tc>
           <w:tcPr>
             <w:tcW w:w="2600" w:type="dxa"/>
+            <w:tcBorders>
+              <w:top w:val="single" w:sz="8" w:space="0" w:color="000000"/>
+              <w:left w:val="single" w:sz="8" w:space="0" w:color="000000"/>
+              <w:bottom w:val="single" w:sz="8" w:space="0" w:color="000000"/>
+              <w:right w:val="single" w:sz="8" w:space="0" w:color="000000"/>
+            </w:tcBorders>
             <w:tcMar>
               <w:top w:w="100" w:type="dxa"/>
               <w:left w:w="100" w:type="dxa"/>
@@ -1162,15 +1535,16 @@
               <w:keepNext/>
               <w:widowControl w:val="0"/>
               <w:spacing w:line="240" w:lineRule="auto"/>
-              <w:ind w:left="0" w:firstLine="0"/>
-              <w:jc w:val="left"/>
-              <w:rPr>
-                <w:b/>
-                <w:bCs/>
-              </w:rPr>
-            </w:pPr>
-            <w:r>
-              <w:rPr>
+              <w:ind w:left="0"/>
+              <w:jc w:val="left"/>
+              <w:rPr>
+                <w:b/>
+                <w:bCs/>
+              </w:rPr>
+            </w:pPr>
+            <w:r>
+              <w:rPr>
+                <w:rFonts w:ascii="Open Sans" w:hAnsi="Open Sans" w:eastAsia="Open Sans" w:cs="Open Sans"/>
                 <w:b/>
                 <w:bCs/>
               </w:rPr>
@@ -1186,6 +1560,12 @@
         <w:tc>
           <w:tcPr>
             <w:tcW w:w="4960" w:type="dxa"/>
+            <w:tcBorders>
+              <w:top w:val="single" w:sz="8" w:space="0" w:color="000000"/>
+              <w:left w:val="single" w:sz="8" w:space="0" w:color="000000"/>
+              <w:bottom w:val="single" w:sz="8" w:space="0" w:color="000000"/>
+              <w:right w:val="single" w:sz="8" w:space="0" w:color="000000"/>
+            </w:tcBorders>
             <w:tcMar>
               <w:top w:w="100" w:type="dxa"/>
               <w:left w:w="100" w:type="dxa"/>
@@ -1201,9 +1581,13 @@
                 <w:numId w:val="103"/>
               </w:numPr>
               <w:spacing w:line="240" w:lineRule="auto"/>
-              <w:jc w:val="left"/>
-            </w:pPr>
-            <w:r>
+              <w:ind w:left="720" w:hanging="360"/>
+              <w:jc w:val="left"/>
+            </w:pPr>
+            <w:r>
+              <w:rPr>
+                <w:rFonts w:ascii="Open Sans" w:hAnsi="Open Sans" w:eastAsia="Open Sans" w:cs="Open Sans"/>
+              </w:rPr>
               <w:t>Conhecer seu logradouro e número</w:t>
             </w:r>
           </w:p>
@@ -1215,9 +1599,13 @@
                 <w:numId w:val="103"/>
               </w:numPr>
               <w:spacing w:line="240" w:lineRule="auto"/>
-              <w:jc w:val="left"/>
-            </w:pPr>
-            <w:r>
+              <w:ind w:left="720" w:hanging="360"/>
+              <w:jc w:val="left"/>
+            </w:pPr>
+            <w:r>
+              <w:rPr>
+                <w:rFonts w:ascii="Open Sans" w:hAnsi="Open Sans" w:eastAsia="Open Sans" w:cs="Open Sans"/>
+              </w:rPr>
               <w:t>Conhecer seu bairro</w:t>
             </w:r>
           </w:p>
@@ -1229,9 +1617,13 @@
                 <w:numId w:val="103"/>
               </w:numPr>
               <w:spacing w:line="240" w:lineRule="auto"/>
-              <w:jc w:val="left"/>
-            </w:pPr>
-            <w:r>
+              <w:ind w:left="720" w:hanging="360"/>
+              <w:jc w:val="left"/>
+            </w:pPr>
+            <w:r>
+              <w:rPr>
+                <w:rFonts w:ascii="Open Sans" w:hAnsi="Open Sans" w:eastAsia="Open Sans" w:cs="Open Sans"/>
+              </w:rPr>
               <w:t>Conhecer sua cidade e estado</w:t>
             </w:r>
           </w:p>
@@ -1243,9 +1635,13 @@
                 <w:numId w:val="103"/>
               </w:numPr>
               <w:spacing w:line="240" w:lineRule="auto"/>
-              <w:jc w:val="left"/>
-            </w:pPr>
-            <w:r>
+              <w:ind w:left="720" w:hanging="360"/>
+              <w:jc w:val="left"/>
+            </w:pPr>
+            <w:r>
+              <w:rPr>
+                <w:rFonts w:ascii="Open Sans" w:hAnsi="Open Sans" w:eastAsia="Open Sans" w:cs="Open Sans"/>
+              </w:rPr>
               <w:t>Conhecer seu CEP</w:t>
             </w:r>
           </w:p>
@@ -1257,9 +1653,13 @@
                 <w:numId w:val="103"/>
               </w:numPr>
               <w:spacing w:line="240" w:lineRule="auto"/>
-              <w:jc w:val="left"/>
-            </w:pPr>
-            <w:r>
+              <w:ind w:left="720" w:hanging="360"/>
+              <w:jc w:val="left"/>
+            </w:pPr>
+            <w:r>
+              <w:rPr>
+                <w:rFonts w:ascii="Open Sans" w:hAnsi="Open Sans" w:eastAsia="Open Sans" w:cs="Open Sans"/>
+              </w:rPr>
               <w:t>Fornecer o endereço formatado</w:t>
             </w:r>
           </w:p>
@@ -1267,6 +1667,12 @@
         <w:tc>
           <w:tcPr>
             <w:tcW w:w="2600" w:type="dxa"/>
+            <w:tcBorders>
+              <w:top w:val="single" w:sz="8" w:space="0" w:color="000000"/>
+              <w:left w:val="single" w:sz="8" w:space="0" w:color="000000"/>
+              <w:bottom w:val="single" w:sz="8" w:space="0" w:color="000000"/>
+              <w:right w:val="single" w:sz="8" w:space="0" w:color="000000"/>
+            </w:tcBorders>
             <w:tcMar>
               <w:top w:w="100" w:type="dxa"/>
               <w:left w:w="100" w:type="dxa"/>
@@ -1278,10 +1684,13 @@
             <w:pPr>
               <w:widowControl w:val="0"/>
               <w:spacing w:line="240" w:lineRule="auto"/>
-              <w:ind w:left="0" w:firstLine="0"/>
-              <w:jc w:val="left"/>
-            </w:pPr>
-            <w:r>
+              <w:ind w:left="0"/>
+              <w:jc w:val="left"/>
+            </w:pPr>
+            <w:r>
+              <w:rPr>
+                <w:rFonts w:ascii="Open Sans" w:hAnsi="Open Sans" w:eastAsia="Open Sans" w:cs="Open Sans"/>
+              </w:rPr>
               <w:t>—</w:t>
             </w:r>
           </w:p>
@@ -1290,7 +1699,8 @@
     </w:tbl>
     <w:p>
       <w:pPr>
-        <w:ind w:left="0" w:firstLine="0"/>
+        <w:ind w:left="0"/>
+        <w:jc w:val="both"/>
       </w:pPr>
     </w:p>
     <w:p>
@@ -1300,8 +1710,15 @@
           <w:ilvl w:val="1"/>
           <w:numId w:val="9"/>
         </w:numPr>
+        <w:ind w:left="1440" w:hanging="360"/>
+        <w:jc w:val="both"/>
       </w:pPr>
       <w:r>
+        <w:rPr>
+          <w:rFonts w:ascii="Roboto Light" w:hAnsi="Roboto Light" w:eastAsia="Roboto Light" w:cs="Roboto Light"/>
+          <w:sz w:val="28"/>
+          <w:szCs w:val="28"/>
+        </w:rPr>
         <w:t>Cartões CRC - Caso de Uso: Agendar e Controlar Consultas</w:t>
       </w:r>
     </w:p>
@@ -1319,7 +1736,13 @@
           <w:insideV w:val="single" w:sz="8" w:space="0" w:color="000000"/>
         </w:tblBorders>
         <w:tblLayout w:type="fixed"/>
-        <w:tblLook w:val="0600" w:firstRow="0" w:lastRow="0" w:firstColumn="0" w:lastColumn="0" w:noHBand="1" w:noVBand="1"/>
+        <w:tblCellMar>
+          <w:top w:w="100" w:type="dxa"/>
+          <w:left w:w="100" w:type="dxa"/>
+          <w:bottom w:w="100" w:type="dxa"/>
+          <w:right w:w="100" w:type="dxa"/>
+        </w:tblCellMar>
+        <w:tblLook w:noHBand="1" w:noVBand="1"/>
       </w:tblPr>
       <w:tblGrid>
         <w:gridCol w:w="4960"/>
@@ -1334,6 +1757,12 @@
           <w:tcPr>
             <w:tcW w:w="7560" w:type="dxa"/>
             <w:gridSpan w:val="2"/>
+            <w:tcBorders>
+              <w:top w:val="single" w:sz="8" w:space="0" w:color="000000"/>
+              <w:left w:val="single" w:sz="8" w:space="0" w:color="000000"/>
+              <w:bottom w:val="single" w:sz="8" w:space="0" w:color="000000"/>
+              <w:right w:val="single" w:sz="8" w:space="0" w:color="000000"/>
+            </w:tcBorders>
             <w:tcMar>
               <w:top w:w="100" w:type="dxa"/>
               <w:left w:w="100" w:type="dxa"/>
@@ -1346,15 +1775,16 @@
               <w:keepNext/>
               <w:widowControl w:val="0"/>
               <w:spacing w:line="240" w:lineRule="auto"/>
-              <w:ind w:left="0" w:firstLine="0"/>
-              <w:jc w:val="left"/>
-              <w:rPr>
-                <w:b/>
-                <w:bCs/>
-              </w:rPr>
-            </w:pPr>
-            <w:r>
-              <w:rPr>
+              <w:ind w:left="0"/>
+              <w:jc w:val="left"/>
+              <w:rPr>
+                <w:b/>
+                <w:bCs/>
+              </w:rPr>
+            </w:pPr>
+            <w:r>
+              <w:rPr>
+                <w:rFonts w:ascii="Open Sans" w:hAnsi="Open Sans" w:eastAsia="Open Sans" w:cs="Open Sans"/>
                 <w:b/>
                 <w:bCs/>
               </w:rPr>
@@ -1370,6 +1800,12 @@
         <w:tc>
           <w:tcPr>
             <w:tcW w:w="4960" w:type="dxa"/>
+            <w:tcBorders>
+              <w:top w:val="single" w:sz="8" w:space="0" w:color="000000"/>
+              <w:left w:val="single" w:sz="8" w:space="0" w:color="000000"/>
+              <w:bottom w:val="single" w:sz="8" w:space="0" w:color="000000"/>
+              <w:right w:val="single" w:sz="8" w:space="0" w:color="000000"/>
+            </w:tcBorders>
             <w:tcMar>
               <w:top w:w="100" w:type="dxa"/>
               <w:left w:w="100" w:type="dxa"/>
@@ -1382,15 +1818,16 @@
               <w:keepNext/>
               <w:widowControl w:val="0"/>
               <w:spacing w:line="240" w:lineRule="auto"/>
-              <w:ind w:left="0" w:firstLine="0"/>
-              <w:jc w:val="left"/>
-              <w:rPr>
-                <w:b/>
-                <w:bCs/>
-              </w:rPr>
-            </w:pPr>
-            <w:r>
-              <w:rPr>
+              <w:ind w:left="0"/>
+              <w:jc w:val="left"/>
+              <w:rPr>
+                <w:b/>
+                <w:bCs/>
+              </w:rPr>
+            </w:pPr>
+            <w:r>
+              <w:rPr>
+                <w:rFonts w:ascii="Open Sans" w:hAnsi="Open Sans" w:eastAsia="Open Sans" w:cs="Open Sans"/>
                 <w:b/>
                 <w:bCs/>
               </w:rPr>
@@ -1401,6 +1838,12 @@
         <w:tc>
           <w:tcPr>
             <w:tcW w:w="2600" w:type="dxa"/>
+            <w:tcBorders>
+              <w:top w:val="single" w:sz="8" w:space="0" w:color="000000"/>
+              <w:left w:val="single" w:sz="8" w:space="0" w:color="000000"/>
+              <w:bottom w:val="single" w:sz="8" w:space="0" w:color="000000"/>
+              <w:right w:val="single" w:sz="8" w:space="0" w:color="000000"/>
+            </w:tcBorders>
             <w:tcMar>
               <w:top w:w="100" w:type="dxa"/>
               <w:left w:w="100" w:type="dxa"/>
@@ -1413,15 +1856,16 @@
               <w:keepNext/>
               <w:widowControl w:val="0"/>
               <w:spacing w:line="240" w:lineRule="auto"/>
-              <w:ind w:left="0" w:firstLine="0"/>
-              <w:jc w:val="left"/>
-              <w:rPr>
-                <w:b/>
-                <w:bCs/>
-              </w:rPr>
-            </w:pPr>
-            <w:r>
-              <w:rPr>
+              <w:ind w:left="0"/>
+              <w:jc w:val="left"/>
+              <w:rPr>
+                <w:b/>
+                <w:bCs/>
+              </w:rPr>
+            </w:pPr>
+            <w:r>
+              <w:rPr>
+                <w:rFonts w:ascii="Open Sans" w:hAnsi="Open Sans" w:eastAsia="Open Sans" w:cs="Open Sans"/>
                 <w:b/>
                 <w:bCs/>
               </w:rPr>
@@ -1437,6 +1881,12 @@
         <w:tc>
           <w:tcPr>
             <w:tcW w:w="4960" w:type="dxa"/>
+            <w:tcBorders>
+              <w:top w:val="single" w:sz="8" w:space="0" w:color="000000"/>
+              <w:left w:val="single" w:sz="8" w:space="0" w:color="000000"/>
+              <w:bottom w:val="single" w:sz="8" w:space="0" w:color="000000"/>
+              <w:right w:val="single" w:sz="8" w:space="0" w:color="000000"/>
+            </w:tcBorders>
             <w:tcMar>
               <w:top w:w="100" w:type="dxa"/>
               <w:left w:w="100" w:type="dxa"/>
@@ -1452,9 +1902,13 @@
                 <w:numId w:val="104"/>
               </w:numPr>
               <w:spacing w:line="240" w:lineRule="auto"/>
-              <w:jc w:val="left"/>
-            </w:pPr>
-            <w:r>
+              <w:ind w:left="720" w:hanging="360"/>
+              <w:jc w:val="left"/>
+            </w:pPr>
+            <w:r>
+              <w:rPr>
+                <w:rFonts w:ascii="Open Sans" w:hAnsi="Open Sans" w:eastAsia="Open Sans" w:cs="Open Sans"/>
+              </w:rPr>
               <w:t>Conhecer o paciente atendido</w:t>
             </w:r>
           </w:p>
@@ -1466,9 +1920,13 @@
                 <w:numId w:val="104"/>
               </w:numPr>
               <w:spacing w:line="240" w:lineRule="auto"/>
-              <w:jc w:val="left"/>
-            </w:pPr>
-            <w:r>
+              <w:ind w:left="720" w:hanging="360"/>
+              <w:jc w:val="left"/>
+            </w:pPr>
+            <w:r>
+              <w:rPr>
+                <w:rFonts w:ascii="Open Sans" w:hAnsi="Open Sans" w:eastAsia="Open Sans" w:cs="Open Sans"/>
+              </w:rPr>
               <w:t>Conhecer o profissional responsável</w:t>
             </w:r>
           </w:p>
@@ -1480,9 +1938,13 @@
                 <w:numId w:val="104"/>
               </w:numPr>
               <w:spacing w:line="240" w:lineRule="auto"/>
-              <w:jc w:val="left"/>
-            </w:pPr>
-            <w:r>
+              <w:ind w:left="720" w:hanging="360"/>
+              <w:jc w:val="left"/>
+            </w:pPr>
+            <w:r>
+              <w:rPr>
+                <w:rFonts w:ascii="Open Sans" w:hAnsi="Open Sans" w:eastAsia="Open Sans" w:cs="Open Sans"/>
+              </w:rPr>
               <w:t>Conhecer as observações médicas</w:t>
             </w:r>
           </w:p>
@@ -1494,9 +1956,13 @@
                 <w:numId w:val="104"/>
               </w:numPr>
               <w:spacing w:line="240" w:lineRule="auto"/>
-              <w:jc w:val="left"/>
-            </w:pPr>
-            <w:r>
+              <w:ind w:left="720" w:hanging="360"/>
+              <w:jc w:val="left"/>
+            </w:pPr>
+            <w:r>
+              <w:rPr>
+                <w:rFonts w:ascii="Open Sans" w:hAnsi="Open Sans" w:eastAsia="Open Sans" w:cs="Open Sans"/>
+              </w:rPr>
               <w:t>Fornecer sua data de referência para ordenação no histórico</w:t>
             </w:r>
           </w:p>
@@ -1504,6 +1970,12 @@
         <w:tc>
           <w:tcPr>
             <w:tcW w:w="2600" w:type="dxa"/>
+            <w:tcBorders>
+              <w:top w:val="single" w:sz="8" w:space="0" w:color="000000"/>
+              <w:left w:val="single" w:sz="8" w:space="0" w:color="000000"/>
+              <w:bottom w:val="single" w:sz="8" w:space="0" w:color="000000"/>
+              <w:right w:val="single" w:sz="8" w:space="0" w:color="000000"/>
+            </w:tcBorders>
             <w:tcMar>
               <w:top w:w="100" w:type="dxa"/>
               <w:left w:w="100" w:type="dxa"/>
@@ -1515,10 +1987,13 @@
             <w:pPr>
               <w:widowControl w:val="0"/>
               <w:spacing w:line="240" w:lineRule="auto"/>
-              <w:ind w:left="0" w:firstLine="0"/>
-              <w:jc w:val="left"/>
-            </w:pPr>
-            <w:r>
+              <w:ind w:left="0"/>
+              <w:jc w:val="left"/>
+            </w:pPr>
+            <w:r>
+              <w:rPr>
+                <w:rFonts w:ascii="Open Sans" w:hAnsi="Open Sans" w:eastAsia="Open Sans" w:cs="Open Sans"/>
+              </w:rPr>
               <w:t>Paciente</w:t>
             </w:r>
           </w:p>
@@ -1526,10 +2001,13 @@
             <w:pPr>
               <w:widowControl w:val="0"/>
               <w:spacing w:line="240" w:lineRule="auto"/>
-              <w:ind w:left="0" w:firstLine="0"/>
-              <w:jc w:val="left"/>
-            </w:pPr>
-            <w:r>
+              <w:ind w:left="0"/>
+              <w:jc w:val="left"/>
+            </w:pPr>
+            <w:r>
+              <w:rPr>
+                <w:rFonts w:ascii="Open Sans" w:hAnsi="Open Sans" w:eastAsia="Open Sans" w:cs="Open Sans"/>
+              </w:rPr>
               <w:t>Profissional da Saúde</w:t>
             </w:r>
           </w:p>
@@ -1538,7 +2016,8 @@
     </w:tbl>
     <w:p>
       <w:pPr>
-        <w:ind w:left="0" w:firstLine="0"/>
+        <w:ind w:left="0"/>
+        <w:jc w:val="both"/>
       </w:pPr>
     </w:p>
     <w:tbl>
@@ -1555,7 +2034,13 @@
           <w:insideV w:val="single" w:sz="8" w:space="0" w:color="000000"/>
         </w:tblBorders>
         <w:tblLayout w:type="fixed"/>
-        <w:tblLook w:val="0600" w:firstRow="0" w:lastRow="0" w:firstColumn="0" w:lastColumn="0" w:noHBand="1" w:noVBand="1"/>
+        <w:tblCellMar>
+          <w:top w:w="100" w:type="dxa"/>
+          <w:left w:w="100" w:type="dxa"/>
+          <w:bottom w:w="100" w:type="dxa"/>
+          <w:right w:w="100" w:type="dxa"/>
+        </w:tblCellMar>
+        <w:tblLook w:noHBand="1" w:noVBand="1"/>
       </w:tblPr>
       <w:tblGrid>
         <w:gridCol w:w="4960"/>
@@ -1570,6 +2055,12 @@
           <w:tcPr>
             <w:tcW w:w="7560" w:type="dxa"/>
             <w:gridSpan w:val="2"/>
+            <w:tcBorders>
+              <w:top w:val="single" w:sz="8" w:space="0" w:color="000000"/>
+              <w:left w:val="single" w:sz="8" w:space="0" w:color="000000"/>
+              <w:bottom w:val="single" w:sz="8" w:space="0" w:color="000000"/>
+              <w:right w:val="single" w:sz="8" w:space="0" w:color="000000"/>
+            </w:tcBorders>
             <w:tcMar>
               <w:top w:w="100" w:type="dxa"/>
               <w:left w:w="100" w:type="dxa"/>
@@ -1582,15 +2073,16 @@
               <w:keepNext/>
               <w:widowControl w:val="0"/>
               <w:spacing w:line="240" w:lineRule="auto"/>
-              <w:ind w:left="0" w:firstLine="0"/>
-              <w:jc w:val="left"/>
-              <w:rPr>
-                <w:b/>
-                <w:bCs/>
-              </w:rPr>
-            </w:pPr>
-            <w:r>
-              <w:rPr>
+              <w:ind w:left="0"/>
+              <w:jc w:val="left"/>
+              <w:rPr>
+                <w:b/>
+                <w:bCs/>
+              </w:rPr>
+            </w:pPr>
+            <w:r>
+              <w:rPr>
+                <w:rFonts w:ascii="Open Sans" w:hAnsi="Open Sans" w:eastAsia="Open Sans" w:cs="Open Sans"/>
                 <w:b/>
                 <w:bCs/>
               </w:rPr>
@@ -1606,6 +2098,12 @@
         <w:tc>
           <w:tcPr>
             <w:tcW w:w="4960" w:type="dxa"/>
+            <w:tcBorders>
+              <w:top w:val="single" w:sz="8" w:space="0" w:color="000000"/>
+              <w:left w:val="single" w:sz="8" w:space="0" w:color="000000"/>
+              <w:bottom w:val="single" w:sz="8" w:space="0" w:color="000000"/>
+              <w:right w:val="single" w:sz="8" w:space="0" w:color="000000"/>
+            </w:tcBorders>
             <w:tcMar>
               <w:top w:w="100" w:type="dxa"/>
               <w:left w:w="100" w:type="dxa"/>
@@ -1618,15 +2116,16 @@
               <w:keepNext/>
               <w:widowControl w:val="0"/>
               <w:spacing w:line="240" w:lineRule="auto"/>
-              <w:ind w:left="0" w:firstLine="0"/>
-              <w:jc w:val="left"/>
-              <w:rPr>
-                <w:b/>
-                <w:bCs/>
-              </w:rPr>
-            </w:pPr>
-            <w:r>
-              <w:rPr>
+              <w:ind w:left="0"/>
+              <w:jc w:val="left"/>
+              <w:rPr>
+                <w:b/>
+                <w:bCs/>
+              </w:rPr>
+            </w:pPr>
+            <w:r>
+              <w:rPr>
+                <w:rFonts w:ascii="Open Sans" w:hAnsi="Open Sans" w:eastAsia="Open Sans" w:cs="Open Sans"/>
                 <w:b/>
                 <w:bCs/>
               </w:rPr>
@@ -1637,6 +2136,12 @@
         <w:tc>
           <w:tcPr>
             <w:tcW w:w="2600" w:type="dxa"/>
+            <w:tcBorders>
+              <w:top w:val="single" w:sz="8" w:space="0" w:color="000000"/>
+              <w:left w:val="single" w:sz="8" w:space="0" w:color="000000"/>
+              <w:bottom w:val="single" w:sz="8" w:space="0" w:color="000000"/>
+              <w:right w:val="single" w:sz="8" w:space="0" w:color="000000"/>
+            </w:tcBorders>
             <w:tcMar>
               <w:top w:w="100" w:type="dxa"/>
               <w:left w:w="100" w:type="dxa"/>
@@ -1649,15 +2154,16 @@
               <w:keepNext/>
               <w:widowControl w:val="0"/>
               <w:spacing w:line="240" w:lineRule="auto"/>
-              <w:ind w:left="0" w:firstLine="0"/>
-              <w:jc w:val="left"/>
-              <w:rPr>
-                <w:b/>
-                <w:bCs/>
-              </w:rPr>
-            </w:pPr>
-            <w:r>
-              <w:rPr>
+              <w:ind w:left="0"/>
+              <w:jc w:val="left"/>
+              <w:rPr>
+                <w:b/>
+                <w:bCs/>
+              </w:rPr>
+            </w:pPr>
+            <w:r>
+              <w:rPr>
+                <w:rFonts w:ascii="Open Sans" w:hAnsi="Open Sans" w:eastAsia="Open Sans" w:cs="Open Sans"/>
                 <w:b/>
                 <w:bCs/>
               </w:rPr>
@@ -1673,6 +2179,12 @@
         <w:tc>
           <w:tcPr>
             <w:tcW w:w="4960" w:type="dxa"/>
+            <w:tcBorders>
+              <w:top w:val="single" w:sz="8" w:space="0" w:color="000000"/>
+              <w:left w:val="single" w:sz="8" w:space="0" w:color="000000"/>
+              <w:bottom w:val="single" w:sz="8" w:space="0" w:color="000000"/>
+              <w:right w:val="single" w:sz="8" w:space="0" w:color="000000"/>
+            </w:tcBorders>
             <w:tcMar>
               <w:top w:w="100" w:type="dxa"/>
               <w:left w:w="100" w:type="dxa"/>
@@ -1688,9 +2200,13 @@
                 <w:numId w:val="105"/>
               </w:numPr>
               <w:spacing w:line="240" w:lineRule="auto"/>
-              <w:jc w:val="left"/>
-            </w:pPr>
-            <w:r>
+              <w:ind w:left="720" w:hanging="360"/>
+              <w:jc w:val="left"/>
+            </w:pPr>
+            <w:r>
+              <w:rPr>
+                <w:rFonts w:ascii="Open Sans" w:hAnsi="Open Sans" w:eastAsia="Open Sans" w:cs="Open Sans"/>
+              </w:rPr>
               <w:t>Conhecer sua data e horário</w:t>
             </w:r>
           </w:p>
@@ -1702,9 +2218,13 @@
                 <w:numId w:val="105"/>
               </w:numPr>
               <w:spacing w:line="240" w:lineRule="auto"/>
-              <w:jc w:val="left"/>
-            </w:pPr>
-            <w:r>
+              <w:ind w:left="720" w:hanging="360"/>
+              <w:jc w:val="left"/>
+            </w:pPr>
+            <w:r>
+              <w:rPr>
+                <w:rFonts w:ascii="Open Sans" w:hAnsi="Open Sans" w:eastAsia="Open Sans" w:cs="Open Sans"/>
+              </w:rPr>
               <w:t>Conhecer o motivo da consulta</w:t>
             </w:r>
           </w:p>
@@ -1716,9 +2236,13 @@
                 <w:numId w:val="105"/>
               </w:numPr>
               <w:spacing w:line="240" w:lineRule="auto"/>
-              <w:jc w:val="left"/>
-            </w:pPr>
-            <w:r>
+              <w:ind w:left="720" w:hanging="360"/>
+              <w:jc w:val="left"/>
+            </w:pPr>
+            <w:r>
+              <w:rPr>
+                <w:rFonts w:ascii="Open Sans" w:hAnsi="Open Sans" w:eastAsia="Open Sans" w:cs="Open Sans"/>
+              </w:rPr>
               <w:t>Conhecer seu status (agendada, realizada ou cancelada)</w:t>
             </w:r>
           </w:p>
@@ -1730,9 +2254,13 @@
                 <w:numId w:val="105"/>
               </w:numPr>
               <w:spacing w:line="240" w:lineRule="auto"/>
-              <w:jc w:val="left"/>
-            </w:pPr>
-            <w:r>
+              <w:ind w:left="720" w:hanging="360"/>
+              <w:jc w:val="left"/>
+            </w:pPr>
+            <w:r>
+              <w:rPr>
+                <w:rFonts w:ascii="Open Sans" w:hAnsi="Open Sans" w:eastAsia="Open Sans" w:cs="Open Sans"/>
+              </w:rPr>
               <w:t>Cancelar-se, apenas se ainda estiver agendada</w:t>
             </w:r>
           </w:p>
@@ -1744,9 +2272,13 @@
                 <w:numId w:val="105"/>
               </w:numPr>
               <w:spacing w:line="240" w:lineRule="auto"/>
-              <w:jc w:val="left"/>
-            </w:pPr>
-            <w:r>
+              <w:ind w:left="720" w:hanging="360"/>
+              <w:jc w:val="left"/>
+            </w:pPr>
+            <w:r>
+              <w:rPr>
+                <w:rFonts w:ascii="Open Sans" w:hAnsi="Open Sans" w:eastAsia="Open Sans" w:cs="Open Sans"/>
+              </w:rPr>
               <w:t>Registrar a realização e as observações médicas</w:t>
             </w:r>
           </w:p>
@@ -1758,9 +2290,13 @@
                 <w:numId w:val="105"/>
               </w:numPr>
               <w:spacing w:line="240" w:lineRule="auto"/>
-              <w:jc w:val="left"/>
-            </w:pPr>
-            <w:r>
+              <w:ind w:left="720" w:hanging="360"/>
+              <w:jc w:val="left"/>
+            </w:pPr>
+            <w:r>
+              <w:rPr>
+                <w:rFonts w:ascii="Open Sans" w:hAnsi="Open Sans" w:eastAsia="Open Sans" w:cs="Open Sans"/>
+              </w:rPr>
               <w:t>Verificar se o horário está dentro da disponibilidade do profissional</w:t>
             </w:r>
           </w:p>
@@ -1772,9 +2308,13 @@
                 <w:numId w:val="105"/>
               </w:numPr>
               <w:spacing w:line="240" w:lineRule="auto"/>
-              <w:jc w:val="left"/>
-            </w:pPr>
-            <w:r>
+              <w:ind w:left="720" w:hanging="360"/>
+              <w:jc w:val="left"/>
+            </w:pPr>
+            <w:r>
+              <w:rPr>
+                <w:rFonts w:ascii="Open Sans" w:hAnsi="Open Sans" w:eastAsia="Open Sans" w:cs="Open Sans"/>
+              </w:rPr>
               <w:t>Impedir conflito de horário do profissional</w:t>
             </w:r>
           </w:p>
@@ -1782,6 +2322,12 @@
         <w:tc>
           <w:tcPr>
             <w:tcW w:w="2600" w:type="dxa"/>
+            <w:tcBorders>
+              <w:top w:val="single" w:sz="8" w:space="0" w:color="000000"/>
+              <w:left w:val="single" w:sz="8" w:space="0" w:color="000000"/>
+              <w:bottom w:val="single" w:sz="8" w:space="0" w:color="000000"/>
+              <w:right w:val="single" w:sz="8" w:space="0" w:color="000000"/>
+            </w:tcBorders>
             <w:tcMar>
               <w:top w:w="100" w:type="dxa"/>
               <w:left w:w="100" w:type="dxa"/>
@@ -1793,10 +2339,13 @@
             <w:pPr>
               <w:widowControl w:val="0"/>
               <w:spacing w:line="240" w:lineRule="auto"/>
-              <w:ind w:left="0" w:firstLine="0"/>
-              <w:jc w:val="left"/>
-            </w:pPr>
-            <w:r>
+              <w:ind w:left="0"/>
+              <w:jc w:val="left"/>
+            </w:pPr>
+            <w:r>
+              <w:rPr>
+                <w:rFonts w:ascii="Open Sans" w:hAnsi="Open Sans" w:eastAsia="Open Sans" w:cs="Open Sans"/>
+              </w:rPr>
               <w:t>Atendimento</w:t>
             </w:r>
           </w:p>
@@ -1804,10 +2353,13 @@
             <w:pPr>
               <w:widowControl w:val="0"/>
               <w:spacing w:line="240" w:lineRule="auto"/>
-              <w:ind w:left="0" w:firstLine="0"/>
-              <w:jc w:val="left"/>
-            </w:pPr>
-            <w:r>
+              <w:ind w:left="0"/>
+              <w:jc w:val="left"/>
+            </w:pPr>
+            <w:r>
+              <w:rPr>
+                <w:rFonts w:ascii="Open Sans" w:hAnsi="Open Sans" w:eastAsia="Open Sans" w:cs="Open Sans"/>
+              </w:rPr>
               <w:t>Profissional da Saúde</w:t>
             </w:r>
           </w:p>
@@ -1815,10 +2367,13 @@
             <w:pPr>
               <w:widowControl w:val="0"/>
               <w:spacing w:line="240" w:lineRule="auto"/>
-              <w:ind w:left="0" w:firstLine="0"/>
-              <w:jc w:val="left"/>
-            </w:pPr>
-            <w:r>
+              <w:ind w:left="0"/>
+              <w:jc w:val="left"/>
+            </w:pPr>
+            <w:r>
+              <w:rPr>
+                <w:rFonts w:ascii="Open Sans" w:hAnsi="Open Sans" w:eastAsia="Open Sans" w:cs="Open Sans"/>
+              </w:rPr>
               <w:t>Disponibilidade</w:t>
             </w:r>
           </w:p>
@@ -1826,10 +2381,13 @@
             <w:pPr>
               <w:widowControl w:val="0"/>
               <w:spacing w:line="240" w:lineRule="auto"/>
-              <w:ind w:left="0" w:firstLine="0"/>
-              <w:jc w:val="left"/>
-            </w:pPr>
-            <w:r>
+              <w:ind w:left="0"/>
+              <w:jc w:val="left"/>
+            </w:pPr>
+            <w:r>
+              <w:rPr>
+                <w:rFonts w:ascii="Open Sans" w:hAnsi="Open Sans" w:eastAsia="Open Sans" w:cs="Open Sans"/>
+              </w:rPr>
               <w:t>Status da Consulta</w:t>
             </w:r>
           </w:p>
@@ -1838,7 +2396,8 @@
     </w:tbl>
     <w:p>
       <w:pPr>
-        <w:ind w:left="0" w:firstLine="0"/>
+        <w:ind w:left="0"/>
+        <w:jc w:val="both"/>
       </w:pPr>
     </w:p>
     <w:tbl>
@@ -1855,7 +2414,13 @@
           <w:insideV w:val="single" w:sz="8" w:space="0" w:color="000000"/>
         </w:tblBorders>
         <w:tblLayout w:type="fixed"/>
-        <w:tblLook w:val="0600" w:firstRow="0" w:lastRow="0" w:firstColumn="0" w:lastColumn="0" w:noHBand="1" w:noVBand="1"/>
+        <w:tblCellMar>
+          <w:top w:w="100" w:type="dxa"/>
+          <w:left w:w="100" w:type="dxa"/>
+          <w:bottom w:w="100" w:type="dxa"/>
+          <w:right w:w="100" w:type="dxa"/>
+        </w:tblCellMar>
+        <w:tblLook w:noHBand="1" w:noVBand="1"/>
       </w:tblPr>
       <w:tblGrid>
         <w:gridCol w:w="4960"/>
@@ -1870,6 +2435,12 @@
           <w:tcPr>
             <w:tcW w:w="7560" w:type="dxa"/>
             <w:gridSpan w:val="2"/>
+            <w:tcBorders>
+              <w:top w:val="single" w:sz="8" w:space="0" w:color="000000"/>
+              <w:left w:val="single" w:sz="8" w:space="0" w:color="000000"/>
+              <w:bottom w:val="single" w:sz="8" w:space="0" w:color="000000"/>
+              <w:right w:val="single" w:sz="8" w:space="0" w:color="000000"/>
+            </w:tcBorders>
             <w:tcMar>
               <w:top w:w="100" w:type="dxa"/>
               <w:left w:w="100" w:type="dxa"/>
@@ -1882,15 +2453,16 @@
               <w:keepNext/>
               <w:widowControl w:val="0"/>
               <w:spacing w:line="240" w:lineRule="auto"/>
-              <w:ind w:left="0" w:firstLine="0"/>
-              <w:jc w:val="left"/>
-              <w:rPr>
-                <w:b/>
-                <w:bCs/>
-              </w:rPr>
-            </w:pPr>
-            <w:r>
-              <w:rPr>
+              <w:ind w:left="0"/>
+              <w:jc w:val="left"/>
+              <w:rPr>
+                <w:b/>
+                <w:bCs/>
+              </w:rPr>
+            </w:pPr>
+            <w:r>
+              <w:rPr>
+                <w:rFonts w:ascii="Open Sans" w:hAnsi="Open Sans" w:eastAsia="Open Sans" w:cs="Open Sans"/>
                 <w:b/>
                 <w:bCs/>
               </w:rPr>
@@ -1906,6 +2478,12 @@
         <w:tc>
           <w:tcPr>
             <w:tcW w:w="4960" w:type="dxa"/>
+            <w:tcBorders>
+              <w:top w:val="single" w:sz="8" w:space="0" w:color="000000"/>
+              <w:left w:val="single" w:sz="8" w:space="0" w:color="000000"/>
+              <w:bottom w:val="single" w:sz="8" w:space="0" w:color="000000"/>
+              <w:right w:val="single" w:sz="8" w:space="0" w:color="000000"/>
+            </w:tcBorders>
             <w:tcMar>
               <w:top w:w="100" w:type="dxa"/>
               <w:left w:w="100" w:type="dxa"/>
@@ -1918,15 +2496,16 @@
               <w:keepNext/>
               <w:widowControl w:val="0"/>
               <w:spacing w:line="240" w:lineRule="auto"/>
-              <w:ind w:left="0" w:firstLine="0"/>
-              <w:jc w:val="left"/>
-              <w:rPr>
-                <w:b/>
-                <w:bCs/>
-              </w:rPr>
-            </w:pPr>
-            <w:r>
-              <w:rPr>
+              <w:ind w:left="0"/>
+              <w:jc w:val="left"/>
+              <w:rPr>
+                <w:b/>
+                <w:bCs/>
+              </w:rPr>
+            </w:pPr>
+            <w:r>
+              <w:rPr>
+                <w:rFonts w:ascii="Open Sans" w:hAnsi="Open Sans" w:eastAsia="Open Sans" w:cs="Open Sans"/>
                 <w:b/>
                 <w:bCs/>
               </w:rPr>
@@ -1937,6 +2516,12 @@
         <w:tc>
           <w:tcPr>
             <w:tcW w:w="2600" w:type="dxa"/>
+            <w:tcBorders>
+              <w:top w:val="single" w:sz="8" w:space="0" w:color="000000"/>
+              <w:left w:val="single" w:sz="8" w:space="0" w:color="000000"/>
+              <w:bottom w:val="single" w:sz="8" w:space="0" w:color="000000"/>
+              <w:right w:val="single" w:sz="8" w:space="0" w:color="000000"/>
+            </w:tcBorders>
             <w:tcMar>
               <w:top w:w="100" w:type="dxa"/>
               <w:left w:w="100" w:type="dxa"/>
@@ -1949,15 +2534,16 @@
               <w:keepNext/>
               <w:widowControl w:val="0"/>
               <w:spacing w:line="240" w:lineRule="auto"/>
-              <w:ind w:left="0" w:firstLine="0"/>
-              <w:jc w:val="left"/>
-              <w:rPr>
-                <w:b/>
-                <w:bCs/>
-              </w:rPr>
-            </w:pPr>
-            <w:r>
-              <w:rPr>
+              <w:ind w:left="0"/>
+              <w:jc w:val="left"/>
+              <w:rPr>
+                <w:b/>
+                <w:bCs/>
+              </w:rPr>
+            </w:pPr>
+            <w:r>
+              <w:rPr>
+                <w:rFonts w:ascii="Open Sans" w:hAnsi="Open Sans" w:eastAsia="Open Sans" w:cs="Open Sans"/>
                 <w:b/>
                 <w:bCs/>
               </w:rPr>
@@ -1973,6 +2559,12 @@
         <w:tc>
           <w:tcPr>
             <w:tcW w:w="4960" w:type="dxa"/>
+            <w:tcBorders>
+              <w:top w:val="single" w:sz="8" w:space="0" w:color="000000"/>
+              <w:left w:val="single" w:sz="8" w:space="0" w:color="000000"/>
+              <w:bottom w:val="single" w:sz="8" w:space="0" w:color="000000"/>
+              <w:right w:val="single" w:sz="8" w:space="0" w:color="000000"/>
+            </w:tcBorders>
             <w:tcMar>
               <w:top w:w="100" w:type="dxa"/>
               <w:left w:w="100" w:type="dxa"/>
@@ -1988,9 +2580,13 @@
                 <w:numId w:val="106"/>
               </w:numPr>
               <w:spacing w:line="240" w:lineRule="auto"/>
-              <w:jc w:val="left"/>
-            </w:pPr>
-            <w:r>
+              <w:ind w:left="720" w:hanging="360"/>
+              <w:jc w:val="left"/>
+            </w:pPr>
+            <w:r>
+              <w:rPr>
+                <w:rFonts w:ascii="Open Sans" w:hAnsi="Open Sans" w:eastAsia="Open Sans" w:cs="Open Sans"/>
+              </w:rPr>
               <w:t>Conhecer o profissional a que pertence</w:t>
             </w:r>
           </w:p>
@@ -2002,9 +2598,13 @@
                 <w:numId w:val="106"/>
               </w:numPr>
               <w:spacing w:line="240" w:lineRule="auto"/>
-              <w:jc w:val="left"/>
-            </w:pPr>
-            <w:r>
+              <w:ind w:left="720" w:hanging="360"/>
+              <w:jc w:val="left"/>
+            </w:pPr>
+            <w:r>
+              <w:rPr>
+                <w:rFonts w:ascii="Open Sans" w:hAnsi="Open Sans" w:eastAsia="Open Sans" w:cs="Open Sans"/>
+              </w:rPr>
               <w:t>Conhecer o dia da semana de atendimento</w:t>
             </w:r>
           </w:p>
@@ -2016,9 +2616,13 @@
                 <w:numId w:val="106"/>
               </w:numPr>
               <w:spacing w:line="240" w:lineRule="auto"/>
-              <w:jc w:val="left"/>
-            </w:pPr>
-            <w:r>
+              <w:ind w:left="720" w:hanging="360"/>
+              <w:jc w:val="left"/>
+            </w:pPr>
+            <w:r>
+              <w:rPr>
+                <w:rFonts w:ascii="Open Sans" w:hAnsi="Open Sans" w:eastAsia="Open Sans" w:cs="Open Sans"/>
+              </w:rPr>
               <w:t>Conhecer o horário de início e de término</w:t>
             </w:r>
           </w:p>
@@ -2030,9 +2634,13 @@
                 <w:numId w:val="106"/>
               </w:numPr>
               <w:spacing w:line="240" w:lineRule="auto"/>
-              <w:jc w:val="left"/>
-            </w:pPr>
-            <w:r>
+              <w:ind w:left="720" w:hanging="360"/>
+              <w:jc w:val="left"/>
+            </w:pPr>
+            <w:r>
+              <w:rPr>
+                <w:rFonts w:ascii="Open Sans" w:hAnsi="Open Sans" w:eastAsia="Open Sans" w:cs="Open Sans"/>
+              </w:rPr>
               <w:t>Verificar se um horário está dentro da sua janela de atendimento</w:t>
             </w:r>
           </w:p>
@@ -2040,6 +2648,12 @@
         <w:tc>
           <w:tcPr>
             <w:tcW w:w="2600" w:type="dxa"/>
+            <w:tcBorders>
+              <w:top w:val="single" w:sz="8" w:space="0" w:color="000000"/>
+              <w:left w:val="single" w:sz="8" w:space="0" w:color="000000"/>
+              <w:bottom w:val="single" w:sz="8" w:space="0" w:color="000000"/>
+              <w:right w:val="single" w:sz="8" w:space="0" w:color="000000"/>
+            </w:tcBorders>
             <w:tcMar>
               <w:top w:w="100" w:type="dxa"/>
               <w:left w:w="100" w:type="dxa"/>
@@ -2051,10 +2665,13 @@
             <w:pPr>
               <w:widowControl w:val="0"/>
               <w:spacing w:line="240" w:lineRule="auto"/>
-              <w:ind w:left="0" w:firstLine="0"/>
-              <w:jc w:val="left"/>
-            </w:pPr>
-            <w:r>
+              <w:ind w:left="0"/>
+              <w:jc w:val="left"/>
+            </w:pPr>
+            <w:r>
+              <w:rPr>
+                <w:rFonts w:ascii="Open Sans" w:hAnsi="Open Sans" w:eastAsia="Open Sans" w:cs="Open Sans"/>
+              </w:rPr>
               <w:t>Profissional da Saúde</w:t>
             </w:r>
           </w:p>
@@ -2063,7 +2680,8 @@
     </w:tbl>
     <w:p>
       <w:pPr>
-        <w:ind w:left="0" w:firstLine="0"/>
+        <w:ind w:left="0"/>
+        <w:jc w:val="both"/>
       </w:pPr>
     </w:p>
     <w:tbl>
@@ -2080,7 +2698,13 @@
           <w:insideV w:val="single" w:sz="8" w:space="0" w:color="000000"/>
         </w:tblBorders>
         <w:tblLayout w:type="fixed"/>
-        <w:tblLook w:val="0600" w:firstRow="0" w:lastRow="0" w:firstColumn="0" w:lastColumn="0" w:noHBand="1" w:noVBand="1"/>
+        <w:tblCellMar>
+          <w:top w:w="100" w:type="dxa"/>
+          <w:left w:w="100" w:type="dxa"/>
+          <w:bottom w:w="100" w:type="dxa"/>
+          <w:right w:w="100" w:type="dxa"/>
+        </w:tblCellMar>
+        <w:tblLook w:noHBand="1" w:noVBand="1"/>
       </w:tblPr>
       <w:tblGrid>
         <w:gridCol w:w="4960"/>
@@ -2095,6 +2719,12 @@
           <w:tcPr>
             <w:tcW w:w="7560" w:type="dxa"/>
             <w:gridSpan w:val="2"/>
+            <w:tcBorders>
+              <w:top w:val="single" w:sz="8" w:space="0" w:color="000000"/>
+              <w:left w:val="single" w:sz="8" w:space="0" w:color="000000"/>
+              <w:bottom w:val="single" w:sz="8" w:space="0" w:color="000000"/>
+              <w:right w:val="single" w:sz="8" w:space="0" w:color="000000"/>
+            </w:tcBorders>
             <w:tcMar>
               <w:top w:w="100" w:type="dxa"/>
               <w:left w:w="100" w:type="dxa"/>
@@ -2107,15 +2737,16 @@
               <w:keepNext/>
               <w:widowControl w:val="0"/>
               <w:spacing w:line="240" w:lineRule="auto"/>
-              <w:ind w:left="0" w:firstLine="0"/>
-              <w:jc w:val="left"/>
-              <w:rPr>
-                <w:b/>
-                <w:bCs/>
-              </w:rPr>
-            </w:pPr>
-            <w:r>
-              <w:rPr>
+              <w:ind w:left="0"/>
+              <w:jc w:val="left"/>
+              <w:rPr>
+                <w:b/>
+                <w:bCs/>
+              </w:rPr>
+            </w:pPr>
+            <w:r>
+              <w:rPr>
+                <w:rFonts w:ascii="Open Sans" w:hAnsi="Open Sans" w:eastAsia="Open Sans" w:cs="Open Sans"/>
                 <w:b/>
                 <w:bCs/>
               </w:rPr>
@@ -2131,6 +2762,12 @@
         <w:tc>
           <w:tcPr>
             <w:tcW w:w="4960" w:type="dxa"/>
+            <w:tcBorders>
+              <w:top w:val="single" w:sz="8" w:space="0" w:color="000000"/>
+              <w:left w:val="single" w:sz="8" w:space="0" w:color="000000"/>
+              <w:bottom w:val="single" w:sz="8" w:space="0" w:color="000000"/>
+              <w:right w:val="single" w:sz="8" w:space="0" w:color="000000"/>
+            </w:tcBorders>
             <w:tcMar>
               <w:top w:w="100" w:type="dxa"/>
               <w:left w:w="100" w:type="dxa"/>
@@ -2143,15 +2780,16 @@
               <w:keepNext/>
               <w:widowControl w:val="0"/>
               <w:spacing w:line="240" w:lineRule="auto"/>
-              <w:ind w:left="0" w:firstLine="0"/>
-              <w:jc w:val="left"/>
-              <w:rPr>
-                <w:b/>
-                <w:bCs/>
-              </w:rPr>
-            </w:pPr>
-            <w:r>
-              <w:rPr>
+              <w:ind w:left="0"/>
+              <w:jc w:val="left"/>
+              <w:rPr>
+                <w:b/>
+                <w:bCs/>
+              </w:rPr>
+            </w:pPr>
+            <w:r>
+              <w:rPr>
+                <w:rFonts w:ascii="Open Sans" w:hAnsi="Open Sans" w:eastAsia="Open Sans" w:cs="Open Sans"/>
                 <w:b/>
                 <w:bCs/>
               </w:rPr>
@@ -2162,6 +2800,12 @@
         <w:tc>
           <w:tcPr>
             <w:tcW w:w="2600" w:type="dxa"/>
+            <w:tcBorders>
+              <w:top w:val="single" w:sz="8" w:space="0" w:color="000000"/>
+              <w:left w:val="single" w:sz="8" w:space="0" w:color="000000"/>
+              <w:bottom w:val="single" w:sz="8" w:space="0" w:color="000000"/>
+              <w:right w:val="single" w:sz="8" w:space="0" w:color="000000"/>
+            </w:tcBorders>
             <w:tcMar>
               <w:top w:w="100" w:type="dxa"/>
               <w:left w:w="100" w:type="dxa"/>
@@ -2174,15 +2818,16 @@
               <w:keepNext/>
               <w:widowControl w:val="0"/>
               <w:spacing w:line="240" w:lineRule="auto"/>
-              <w:ind w:left="0" w:firstLine="0"/>
-              <w:jc w:val="left"/>
-              <w:rPr>
-                <w:b/>
-                <w:bCs/>
-              </w:rPr>
-            </w:pPr>
-            <w:r>
-              <w:rPr>
+              <w:ind w:left="0"/>
+              <w:jc w:val="left"/>
+              <w:rPr>
+                <w:b/>
+                <w:bCs/>
+              </w:rPr>
+            </w:pPr>
+            <w:r>
+              <w:rPr>
+                <w:rFonts w:ascii="Open Sans" w:hAnsi="Open Sans" w:eastAsia="Open Sans" w:cs="Open Sans"/>
                 <w:b/>
                 <w:bCs/>
               </w:rPr>
@@ -2198,6 +2843,12 @@
         <w:tc>
           <w:tcPr>
             <w:tcW w:w="4960" w:type="dxa"/>
+            <w:tcBorders>
+              <w:top w:val="single" w:sz="8" w:space="0" w:color="000000"/>
+              <w:left w:val="single" w:sz="8" w:space="0" w:color="000000"/>
+              <w:bottom w:val="single" w:sz="8" w:space="0" w:color="000000"/>
+              <w:right w:val="single" w:sz="8" w:space="0" w:color="000000"/>
+            </w:tcBorders>
             <w:tcMar>
               <w:top w:w="100" w:type="dxa"/>
               <w:left w:w="100" w:type="dxa"/>
@@ -2213,30 +2864,26 @@
                 <w:numId w:val="107"/>
               </w:numPr>
               <w:spacing w:line="240" w:lineRule="auto"/>
-              <w:jc w:val="left"/>
-            </w:pPr>
-            <w:r>
+              <w:ind w:left="720" w:hanging="360"/>
+              <w:jc w:val="left"/>
+            </w:pPr>
+            <w:r>
+              <w:rPr>
+                <w:rFonts w:ascii="Open Sans" w:hAnsi="Open Sans" w:eastAsia="Open Sans" w:cs="Open Sans"/>
+              </w:rPr>
               <w:t>Representar os estados possíveis: agendada, realizada e cancelada</w:t>
-            </w:r>
-          </w:p>
-          <w:p>
-            <w:pPr>
-              <w:widowControl w:val="0"/>
-              <w:numPr>
-                <w:ilvl w:val="0"/>
-                <w:numId w:val="107"/>
-              </w:numPr>
-              <w:spacing w:line="240" w:lineRule="auto"/>
-              <w:jc w:val="left"/>
-            </w:pPr>
-            <w:r>
-              <w:t>Indicar se a consulta ainda pode ser alterada ou cancelada</w:t>
             </w:r>
           </w:p>
         </w:tc>
         <w:tc>
           <w:tcPr>
             <w:tcW w:w="2600" w:type="dxa"/>
+            <w:tcBorders>
+              <w:top w:val="single" w:sz="8" w:space="0" w:color="000000"/>
+              <w:left w:val="single" w:sz="8" w:space="0" w:color="000000"/>
+              <w:bottom w:val="single" w:sz="8" w:space="0" w:color="000000"/>
+              <w:right w:val="single" w:sz="8" w:space="0" w:color="000000"/>
+            </w:tcBorders>
             <w:tcMar>
               <w:top w:w="100" w:type="dxa"/>
               <w:left w:w="100" w:type="dxa"/>
@@ -2248,10 +2895,13 @@
             <w:pPr>
               <w:widowControl w:val="0"/>
               <w:spacing w:line="240" w:lineRule="auto"/>
-              <w:ind w:left="0" w:firstLine="0"/>
-              <w:jc w:val="left"/>
-            </w:pPr>
-            <w:r>
+              <w:ind w:left="0"/>
+              <w:jc w:val="left"/>
+            </w:pPr>
+            <w:r>
+              <w:rPr>
+                <w:rFonts w:ascii="Open Sans" w:hAnsi="Open Sans" w:eastAsia="Open Sans" w:cs="Open Sans"/>
+              </w:rPr>
               <w:t>—</w:t>
             </w:r>
           </w:p>
@@ -2260,7 +2910,8 @@
     </w:tbl>
     <w:p>
       <w:pPr>
-        <w:ind w:left="0" w:firstLine="0"/>
+        <w:ind w:left="0"/>
+        <w:jc w:val="both"/>
       </w:pPr>
     </w:p>
     <w:p>
@@ -2270,8 +2921,15 @@
           <w:ilvl w:val="1"/>
           <w:numId w:val="9"/>
         </w:numPr>
+        <w:ind w:left="1440" w:hanging="360"/>
+        <w:jc w:val="both"/>
       </w:pPr>
       <w:r>
+        <w:rPr>
+          <w:rFonts w:ascii="Roboto Light" w:hAnsi="Roboto Light" w:eastAsia="Roboto Light" w:cs="Roboto Light"/>
+          <w:sz w:val="28"/>
+          <w:szCs w:val="28"/>
+        </w:rPr>
         <w:t>Cartões CRC - Caso de Uso: Controlar Internações e Quartos</w:t>
       </w:r>
     </w:p>
@@ -2289,7 +2947,13 @@
           <w:insideV w:val="single" w:sz="8" w:space="0" w:color="000000"/>
         </w:tblBorders>
         <w:tblLayout w:type="fixed"/>
-        <w:tblLook w:val="0600" w:firstRow="0" w:lastRow="0" w:firstColumn="0" w:lastColumn="0" w:noHBand="1" w:noVBand="1"/>
+        <w:tblCellMar>
+          <w:top w:w="100" w:type="dxa"/>
+          <w:left w:w="100" w:type="dxa"/>
+          <w:bottom w:w="100" w:type="dxa"/>
+          <w:right w:w="100" w:type="dxa"/>
+        </w:tblCellMar>
+        <w:tblLook w:noHBand="1" w:noVBand="1"/>
       </w:tblPr>
       <w:tblGrid>
         <w:gridCol w:w="4960"/>
@@ -2304,6 +2968,12 @@
           <w:tcPr>
             <w:tcW w:w="7560" w:type="dxa"/>
             <w:gridSpan w:val="2"/>
+            <w:tcBorders>
+              <w:top w:val="single" w:sz="8" w:space="0" w:color="000000"/>
+              <w:left w:val="single" w:sz="8" w:space="0" w:color="000000"/>
+              <w:bottom w:val="single" w:sz="8" w:space="0" w:color="000000"/>
+              <w:right w:val="single" w:sz="8" w:space="0" w:color="000000"/>
+            </w:tcBorders>
             <w:tcMar>
               <w:top w:w="100" w:type="dxa"/>
               <w:left w:w="100" w:type="dxa"/>
@@ -2316,15 +2986,16 @@
               <w:keepNext/>
               <w:widowControl w:val="0"/>
               <w:spacing w:line="240" w:lineRule="auto"/>
-              <w:ind w:left="0" w:firstLine="0"/>
-              <w:jc w:val="left"/>
-              <w:rPr>
-                <w:b/>
-                <w:bCs/>
-              </w:rPr>
-            </w:pPr>
-            <w:r>
-              <w:rPr>
+              <w:ind w:left="0"/>
+              <w:jc w:val="left"/>
+              <w:rPr>
+                <w:b/>
+                <w:bCs/>
+              </w:rPr>
+            </w:pPr>
+            <w:r>
+              <w:rPr>
+                <w:rFonts w:ascii="Open Sans" w:hAnsi="Open Sans" w:eastAsia="Open Sans" w:cs="Open Sans"/>
                 <w:b/>
                 <w:bCs/>
               </w:rPr>
@@ -2340,6 +3011,12 @@
         <w:tc>
           <w:tcPr>
             <w:tcW w:w="4960" w:type="dxa"/>
+            <w:tcBorders>
+              <w:top w:val="single" w:sz="8" w:space="0" w:color="000000"/>
+              <w:left w:val="single" w:sz="8" w:space="0" w:color="000000"/>
+              <w:bottom w:val="single" w:sz="8" w:space="0" w:color="000000"/>
+              <w:right w:val="single" w:sz="8" w:space="0" w:color="000000"/>
+            </w:tcBorders>
             <w:tcMar>
               <w:top w:w="100" w:type="dxa"/>
               <w:left w:w="100" w:type="dxa"/>
@@ -2352,15 +3029,16 @@
               <w:keepNext/>
               <w:widowControl w:val="0"/>
               <w:spacing w:line="240" w:lineRule="auto"/>
-              <w:ind w:left="0" w:firstLine="0"/>
-              <w:jc w:val="left"/>
-              <w:rPr>
-                <w:b/>
-                <w:bCs/>
-              </w:rPr>
-            </w:pPr>
-            <w:r>
-              <w:rPr>
+              <w:ind w:left="0"/>
+              <w:jc w:val="left"/>
+              <w:rPr>
+                <w:b/>
+                <w:bCs/>
+              </w:rPr>
+            </w:pPr>
+            <w:r>
+              <w:rPr>
+                <w:rFonts w:ascii="Open Sans" w:hAnsi="Open Sans" w:eastAsia="Open Sans" w:cs="Open Sans"/>
                 <w:b/>
                 <w:bCs/>
               </w:rPr>
@@ -2371,6 +3049,12 @@
         <w:tc>
           <w:tcPr>
             <w:tcW w:w="2600" w:type="dxa"/>
+            <w:tcBorders>
+              <w:top w:val="single" w:sz="8" w:space="0" w:color="000000"/>
+              <w:left w:val="single" w:sz="8" w:space="0" w:color="000000"/>
+              <w:bottom w:val="single" w:sz="8" w:space="0" w:color="000000"/>
+              <w:right w:val="single" w:sz="8" w:space="0" w:color="000000"/>
+            </w:tcBorders>
             <w:tcMar>
               <w:top w:w="100" w:type="dxa"/>
               <w:left w:w="100" w:type="dxa"/>
@@ -2383,15 +3067,16 @@
               <w:keepNext/>
               <w:widowControl w:val="0"/>
               <w:spacing w:line="240" w:lineRule="auto"/>
-              <w:ind w:left="0" w:firstLine="0"/>
-              <w:jc w:val="left"/>
-              <w:rPr>
-                <w:b/>
-                <w:bCs/>
-              </w:rPr>
-            </w:pPr>
-            <w:r>
-              <w:rPr>
+              <w:ind w:left="0"/>
+              <w:jc w:val="left"/>
+              <w:rPr>
+                <w:b/>
+                <w:bCs/>
+              </w:rPr>
+            </w:pPr>
+            <w:r>
+              <w:rPr>
+                <w:rFonts w:ascii="Open Sans" w:hAnsi="Open Sans" w:eastAsia="Open Sans" w:cs="Open Sans"/>
                 <w:b/>
                 <w:bCs/>
               </w:rPr>
@@ -2407,6 +3092,12 @@
         <w:tc>
           <w:tcPr>
             <w:tcW w:w="4960" w:type="dxa"/>
+            <w:tcBorders>
+              <w:top w:val="single" w:sz="8" w:space="0" w:color="000000"/>
+              <w:left w:val="single" w:sz="8" w:space="0" w:color="000000"/>
+              <w:bottom w:val="single" w:sz="8" w:space="0" w:color="000000"/>
+              <w:right w:val="single" w:sz="8" w:space="0" w:color="000000"/>
+            </w:tcBorders>
             <w:tcMar>
               <w:top w:w="100" w:type="dxa"/>
               <w:left w:w="100" w:type="dxa"/>
@@ -2422,9 +3113,13 @@
                 <w:numId w:val="108"/>
               </w:numPr>
               <w:spacing w:line="240" w:lineRule="auto"/>
-              <w:jc w:val="left"/>
-            </w:pPr>
-            <w:r>
+              <w:ind w:left="720" w:hanging="360"/>
+              <w:jc w:val="left"/>
+            </w:pPr>
+            <w:r>
+              <w:rPr>
+                <w:rFonts w:ascii="Open Sans" w:hAnsi="Open Sans" w:eastAsia="Open Sans" w:cs="Open Sans"/>
+              </w:rPr>
               <w:t>Conhecer o quarto ocupado</w:t>
             </w:r>
           </w:p>
@@ -2436,10 +3131,11 @@
                 <w:numId w:val="108"/>
               </w:numPr>
               <w:spacing w:line="240" w:lineRule="auto"/>
-              <w:jc w:val="left"/>
-            </w:pPr>
-            <w:r>
-              <w:t>Conhecer a data de entrada</w:t>
+              <w:ind w:left="720" w:hanging="360"/>
+              <w:jc w:val="left"/>
+            </w:pPr>
+            <w:r>
+              <w:t>Conhecer o paciente internado</w:t>
             </w:r>
           </w:p>
           <w:p>
@@ -2450,10 +3146,11 @@
                 <w:numId w:val="108"/>
               </w:numPr>
               <w:spacing w:line="240" w:lineRule="auto"/>
-              <w:jc w:val="left"/>
-            </w:pPr>
-            <w:r>
-              <w:t>Conhecer a data prevista de alta</w:t>
+              <w:ind w:left="720" w:hanging="360"/>
+              <w:jc w:val="left"/>
+            </w:pPr>
+            <w:r>
+              <w:t>Conhecer o profissional responsável</w:t>
             </w:r>
           </w:p>
           <w:p>
@@ -2464,10 +3161,11 @@
                 <w:numId w:val="108"/>
               </w:numPr>
               <w:spacing w:line="240" w:lineRule="auto"/>
-              <w:jc w:val="left"/>
-            </w:pPr>
-            <w:r>
-              <w:t>Conhecer a data efetiva de alta</w:t>
+              <w:ind w:left="720" w:hanging="360"/>
+              <w:jc w:val="left"/>
+            </w:pPr>
+            <w:r>
+              <w:t>Conhecer as observações</w:t>
             </w:r>
           </w:p>
           <w:p>
@@ -2478,10 +3176,14 @@
                 <w:numId w:val="108"/>
               </w:numPr>
               <w:spacing w:line="240" w:lineRule="auto"/>
-              <w:jc w:val="left"/>
-            </w:pPr>
-            <w:r>
-              <w:t>Validar que as datas de alta não sejam anteriores à data de entrada</w:t>
+              <w:ind w:left="720" w:hanging="360"/>
+              <w:jc w:val="left"/>
+            </w:pPr>
+            <w:r>
+              <w:rPr>
+                <w:rFonts w:ascii="Open Sans" w:hAnsi="Open Sans" w:eastAsia="Open Sans" w:cs="Open Sans"/>
+              </w:rPr>
+              <w:t>Conhecer a data de entrada</w:t>
             </w:r>
           </w:p>
           <w:p>
@@ -2492,10 +3194,14 @@
                 <w:numId w:val="108"/>
               </w:numPr>
               <w:spacing w:line="240" w:lineRule="auto"/>
-              <w:jc w:val="left"/>
-            </w:pPr>
-            <w:r>
-              <w:t>Registrar a alta do paciente, liberando a vaga no quarto</w:t>
+              <w:ind w:left="720" w:hanging="360"/>
+              <w:jc w:val="left"/>
+            </w:pPr>
+            <w:r>
+              <w:rPr>
+                <w:rFonts w:ascii="Open Sans" w:hAnsi="Open Sans" w:eastAsia="Open Sans" w:cs="Open Sans"/>
+              </w:rPr>
+              <w:t>Conhecer a data prevista de alta</w:t>
             </w:r>
           </w:p>
           <w:p>
@@ -2506,9 +3212,49 @@
                 <w:numId w:val="108"/>
               </w:numPr>
               <w:spacing w:line="240" w:lineRule="auto"/>
-              <w:jc w:val="left"/>
-            </w:pPr>
-            <w:r>
+              <w:ind w:left="720" w:hanging="360"/>
+              <w:jc w:val="left"/>
+            </w:pPr>
+            <w:r>
+              <w:rPr>
+                <w:rFonts w:ascii="Open Sans" w:hAnsi="Open Sans" w:eastAsia="Open Sans" w:cs="Open Sans"/>
+              </w:rPr>
+              <w:t>Conhecer a data efetiva de alta</w:t>
+            </w:r>
+          </w:p>
+          <w:p>
+            <w:pPr>
+              <w:widowControl w:val="0"/>
+              <w:numPr>
+                <w:ilvl w:val="0"/>
+                <w:numId w:val="108"/>
+              </w:numPr>
+              <w:spacing w:line="240" w:lineRule="auto"/>
+              <w:ind w:left="720" w:hanging="360"/>
+              <w:jc w:val="left"/>
+            </w:pPr>
+            <w:r>
+              <w:rPr>
+                <w:rFonts w:ascii="Open Sans" w:hAnsi="Open Sans" w:eastAsia="Open Sans" w:cs="Open Sans"/>
+              </w:rPr>
+              <w:t>Registrar a alta do paciente na data informada, liberando a vaga no quarto</w:t>
+            </w:r>
+          </w:p>
+          <w:p>
+            <w:pPr>
+              <w:widowControl w:val="0"/>
+              <w:numPr>
+                <w:ilvl w:val="0"/>
+                <w:numId w:val="108"/>
+              </w:numPr>
+              <w:spacing w:line="240" w:lineRule="auto"/>
+              <w:ind w:left="720" w:hanging="360"/>
+              <w:jc w:val="left"/>
+            </w:pPr>
+            <w:r>
+              <w:rPr>
+                <w:rFonts w:ascii="Open Sans" w:hAnsi="Open Sans" w:eastAsia="Open Sans" w:cs="Open Sans"/>
+              </w:rPr>
               <w:t>Verificar se ainda está ativa</w:t>
             </w:r>
           </w:p>
@@ -2516,6 +3262,12 @@
         <w:tc>
           <w:tcPr>
             <w:tcW w:w="2600" w:type="dxa"/>
+            <w:tcBorders>
+              <w:top w:val="single" w:sz="8" w:space="0" w:color="000000"/>
+              <w:left w:val="single" w:sz="8" w:space="0" w:color="000000"/>
+              <w:bottom w:val="single" w:sz="8" w:space="0" w:color="000000"/>
+              <w:right w:val="single" w:sz="8" w:space="0" w:color="000000"/>
+            </w:tcBorders>
             <w:tcMar>
               <w:top w:w="100" w:type="dxa"/>
               <w:left w:w="100" w:type="dxa"/>
@@ -2527,30 +3279,44 @@
             <w:pPr>
               <w:widowControl w:val="0"/>
               <w:spacing w:line="240" w:lineRule="auto"/>
-              <w:ind w:left="0" w:firstLine="0"/>
-              <w:jc w:val="left"/>
-            </w:pPr>
-            <w:r>
-              <w:t>Atendimento</w:t>
-            </w:r>
-          </w:p>
-          <w:p>
-            <w:pPr>
-              <w:widowControl w:val="0"/>
-              <w:spacing w:line="240" w:lineRule="auto"/>
-              <w:ind w:left="0" w:firstLine="0"/>
-              <w:jc w:val="left"/>
-            </w:pPr>
-            <w:r>
+              <w:ind w:left="0"/>
+              <w:jc w:val="left"/>
+            </w:pPr>
+            <w:r>
+              <w:rPr>
+                <w:rFonts w:ascii="Open Sans" w:hAnsi="Open Sans" w:eastAsia="Open Sans" w:cs="Open Sans"/>
+              </w:rPr>
               <w:t>Quarto</w:t>
             </w:r>
+          </w:p>
+          <w:p>
+            <w:pPr>
+              <w:spacing w:line="240" w:lineRule="auto"/>
+            </w:pPr>
+            <w:r>
+              <w:t>Paciente</w:t>
+            </w:r>
+          </w:p>
+          <w:p>
+            <w:pPr>
+              <w:spacing w:line="240" w:lineRule="auto"/>
+            </w:pPr>
+            <w:r>
+              <w:t>Profissional de Saúde</w:t>
+            </w:r>
+          </w:p>
+          <w:p>
+            <w:pPr>
+              <w:spacing w:line="240" w:lineRule="auto"/>
+            </w:pPr>
           </w:p>
         </w:tc>
       </w:tr>
     </w:tbl>
     <w:p>
       <w:pPr>
-        <w:ind w:left="0" w:firstLine="0"/>
+        <w:ind w:left="0"/>
+        <w:jc w:val="both"/>
       </w:pPr>
     </w:p>
     <w:tbl>
@@ -2567,7 +3333,13 @@
           <w:insideV w:val="single" w:sz="8" w:space="0" w:color="000000"/>
         </w:tblBorders>
         <w:tblLayout w:type="fixed"/>
-        <w:tblLook w:val="0600" w:firstRow="0" w:lastRow="0" w:firstColumn="0" w:lastColumn="0" w:noHBand="1" w:noVBand="1"/>
+        <w:tblCellMar>
+          <w:top w:w="100" w:type="dxa"/>
+          <w:left w:w="100" w:type="dxa"/>
+          <w:bottom w:w="100" w:type="dxa"/>
+          <w:right w:w="100" w:type="dxa"/>
+        </w:tblCellMar>
+        <w:tblLook w:noHBand="1" w:noVBand="1"/>
       </w:tblPr>
       <w:tblGrid>
         <w:gridCol w:w="4960"/>
@@ -2582,6 +3354,12 @@
           <w:tcPr>
             <w:tcW w:w="7560" w:type="dxa"/>
             <w:gridSpan w:val="2"/>
+            <w:tcBorders>
+              <w:top w:val="single" w:sz="8" w:space="0" w:color="000000"/>
+              <w:left w:val="single" w:sz="8" w:space="0" w:color="000000"/>
+              <w:bottom w:val="single" w:sz="8" w:space="0" w:color="000000"/>
+              <w:right w:val="single" w:sz="8" w:space="0" w:color="000000"/>
+            </w:tcBorders>
             <w:tcMar>
               <w:top w:w="100" w:type="dxa"/>
               <w:left w:w="100" w:type="dxa"/>
@@ -2594,15 +3372,16 @@
               <w:keepNext/>
               <w:widowControl w:val="0"/>
               <w:spacing w:line="240" w:lineRule="auto"/>
-              <w:ind w:left="0" w:firstLine="0"/>
-              <w:jc w:val="left"/>
-              <w:rPr>
-                <w:b/>
-                <w:bCs/>
-              </w:rPr>
-            </w:pPr>
-            <w:r>
-              <w:rPr>
+              <w:ind w:left="0"/>
+              <w:jc w:val="left"/>
+              <w:rPr>
+                <w:b/>
+                <w:bCs/>
+              </w:rPr>
+            </w:pPr>
+            <w:r>
+              <w:rPr>
+                <w:rFonts w:ascii="Open Sans" w:hAnsi="Open Sans" w:eastAsia="Open Sans" w:cs="Open Sans"/>
                 <w:b/>
                 <w:bCs/>
               </w:rPr>
@@ -2618,6 +3397,12 @@
         <w:tc>
           <w:tcPr>
             <w:tcW w:w="4960" w:type="dxa"/>
+            <w:tcBorders>
+              <w:top w:val="single" w:sz="8" w:space="0" w:color="000000"/>
+              <w:left w:val="single" w:sz="8" w:space="0" w:color="000000"/>
+              <w:bottom w:val="single" w:sz="8" w:space="0" w:color="000000"/>
+              <w:right w:val="single" w:sz="8" w:space="0" w:color="000000"/>
+            </w:tcBorders>
             <w:tcMar>
               <w:top w:w="100" w:type="dxa"/>
               <w:left w:w="100" w:type="dxa"/>
@@ -2630,15 +3415,16 @@
               <w:keepNext/>
               <w:widowControl w:val="0"/>
               <w:spacing w:line="240" w:lineRule="auto"/>
-              <w:ind w:left="0" w:firstLine="0"/>
-              <w:jc w:val="left"/>
-              <w:rPr>
-                <w:b/>
-                <w:bCs/>
-              </w:rPr>
-            </w:pPr>
-            <w:r>
-              <w:rPr>
+              <w:ind w:left="0"/>
+              <w:jc w:val="left"/>
+              <w:rPr>
+                <w:b/>
+                <w:bCs/>
+              </w:rPr>
+            </w:pPr>
+            <w:r>
+              <w:rPr>
+                <w:rFonts w:ascii="Open Sans" w:hAnsi="Open Sans" w:eastAsia="Open Sans" w:cs="Open Sans"/>
                 <w:b/>
                 <w:bCs/>
               </w:rPr>
@@ -2649,6 +3435,12 @@
         <w:tc>
           <w:tcPr>
             <w:tcW w:w="2600" w:type="dxa"/>
+            <w:tcBorders>
+              <w:top w:val="single" w:sz="8" w:space="0" w:color="000000"/>
+              <w:left w:val="single" w:sz="8" w:space="0" w:color="000000"/>
+              <w:bottom w:val="single" w:sz="8" w:space="0" w:color="000000"/>
+              <w:right w:val="single" w:sz="8" w:space="0" w:color="000000"/>
+            </w:tcBorders>
             <w:tcMar>
               <w:top w:w="100" w:type="dxa"/>
               <w:left w:w="100" w:type="dxa"/>
@@ -2661,15 +3453,16 @@
               <w:keepNext/>
               <w:widowControl w:val="0"/>
               <w:spacing w:line="240" w:lineRule="auto"/>
-              <w:ind w:left="0" w:firstLine="0"/>
-              <w:jc w:val="left"/>
-              <w:rPr>
-                <w:b/>
-                <w:bCs/>
-              </w:rPr>
-            </w:pPr>
-            <w:r>
-              <w:rPr>
+              <w:ind w:left="0"/>
+              <w:jc w:val="left"/>
+              <w:rPr>
+                <w:b/>
+                <w:bCs/>
+              </w:rPr>
+            </w:pPr>
+            <w:r>
+              <w:rPr>
+                <w:rFonts w:ascii="Open Sans" w:hAnsi="Open Sans" w:eastAsia="Open Sans" w:cs="Open Sans"/>
                 <w:b/>
                 <w:bCs/>
               </w:rPr>
@@ -2685,6 +3478,12 @@
         <w:tc>
           <w:tcPr>
             <w:tcW w:w="4960" w:type="dxa"/>
+            <w:tcBorders>
+              <w:top w:val="single" w:sz="8" w:space="0" w:color="000000"/>
+              <w:left w:val="single" w:sz="8" w:space="0" w:color="000000"/>
+              <w:bottom w:val="single" w:sz="8" w:space="0" w:color="000000"/>
+              <w:right w:val="single" w:sz="8" w:space="0" w:color="000000"/>
+            </w:tcBorders>
             <w:tcMar>
               <w:top w:w="100" w:type="dxa"/>
               <w:left w:w="100" w:type="dxa"/>
@@ -2700,9 +3499,13 @@
                 <w:numId w:val="109"/>
               </w:numPr>
               <w:spacing w:line="240" w:lineRule="auto"/>
-              <w:jc w:val="left"/>
-            </w:pPr>
-            <w:r>
+              <w:ind w:left="720" w:hanging="360"/>
+              <w:jc w:val="left"/>
+            </w:pPr>
+            <w:r>
+              <w:rPr>
+                <w:rFonts w:ascii="Open Sans" w:hAnsi="Open Sans" w:eastAsia="Open Sans" w:cs="Open Sans"/>
+              </w:rPr>
               <w:t>Conhecer seu número de identificação</w:t>
             </w:r>
           </w:p>
@@ -2714,9 +3517,13 @@
                 <w:numId w:val="109"/>
               </w:numPr>
               <w:spacing w:line="240" w:lineRule="auto"/>
-              <w:jc w:val="left"/>
-            </w:pPr>
-            <w:r>
+              <w:ind w:left="720" w:hanging="360"/>
+              <w:jc w:val="left"/>
+            </w:pPr>
+            <w:r>
+              <w:rPr>
+                <w:rFonts w:ascii="Open Sans" w:hAnsi="Open Sans" w:eastAsia="Open Sans" w:cs="Open Sans"/>
+              </w:rPr>
               <w:t>Conhecer seu andar</w:t>
             </w:r>
           </w:p>
@@ -2728,9 +3535,13 @@
                 <w:numId w:val="109"/>
               </w:numPr>
               <w:spacing w:line="240" w:lineRule="auto"/>
-              <w:jc w:val="left"/>
-            </w:pPr>
-            <w:r>
+              <w:ind w:left="720" w:hanging="360"/>
+              <w:jc w:val="left"/>
+            </w:pPr>
+            <w:r>
+              <w:rPr>
+                <w:rFonts w:ascii="Open Sans" w:hAnsi="Open Sans" w:eastAsia="Open Sans" w:cs="Open Sans"/>
+              </w:rPr>
               <w:t>Conhecer sua capacidade máxima</w:t>
             </w:r>
           </w:p>
@@ -2742,10 +3553,11 @@
                 <w:numId w:val="109"/>
               </w:numPr>
               <w:spacing w:line="240" w:lineRule="auto"/>
-              <w:jc w:val="left"/>
-            </w:pPr>
-            <w:r>
-              <w:t>Conhecer a quantidade de pacientes internados</w:t>
+              <w:ind w:left="720" w:hanging="360"/>
+              <w:jc w:val="left"/>
+            </w:pPr>
+            <w:r>
+              <w:t>Conhecer sua situação atual (disponível ou ocupado)</w:t>
             </w:r>
           </w:p>
           <w:p>
@@ -2756,10 +3568,14 @@
                 <w:numId w:val="109"/>
               </w:numPr>
               <w:spacing w:line="240" w:lineRule="auto"/>
-              <w:jc w:val="left"/>
-            </w:pPr>
-            <w:r>
-              <w:t>Calcular sua situação atual (disponível ou ocupado) a partir da ocupação</w:t>
+              <w:ind w:left="720" w:hanging="360"/>
+              <w:jc w:val="left"/>
+            </w:pPr>
+            <w:r>
+              <w:rPr>
+                <w:rFonts w:ascii="Open Sans" w:hAnsi="Open Sans" w:eastAsia="Open Sans" w:cs="Open Sans"/>
+              </w:rPr>
+              <w:t>Verificar se há vaga disponível</w:t>
             </w:r>
           </w:p>
           <w:p>
@@ -2770,10 +3586,14 @@
                 <w:numId w:val="109"/>
               </w:numPr>
               <w:spacing w:line="240" w:lineRule="auto"/>
-              <w:jc w:val="left"/>
-            </w:pPr>
-            <w:r>
-              <w:t>Verificar se há vaga disponível</w:t>
+              <w:ind w:left="720" w:hanging="360"/>
+              <w:jc w:val="left"/>
+            </w:pPr>
+            <w:r>
+              <w:rPr>
+                <w:rFonts w:ascii="Open Sans" w:hAnsi="Open Sans" w:eastAsia="Open Sans" w:cs="Open Sans"/>
+              </w:rPr>
+              <w:t>Ocupar e liberar vaga</w:t>
             </w:r>
           </w:p>
           <w:p>
@@ -2784,23 +3604,13 @@
                 <w:numId w:val="109"/>
               </w:numPr>
               <w:spacing w:line="240" w:lineRule="auto"/>
-              <w:jc w:val="left"/>
-            </w:pPr>
-            <w:r>
-              <w:t>Ocupar e liberar vaga</w:t>
-            </w:r>
-          </w:p>
-          <w:p>
-            <w:pPr>
-              <w:widowControl w:val="0"/>
-              <w:numPr>
-                <w:ilvl w:val="0"/>
-                <w:numId w:val="109"/>
-              </w:numPr>
-              <w:spacing w:line="240" w:lineRule="auto"/>
-              <w:jc w:val="left"/>
-            </w:pPr>
-            <w:r>
+              <w:ind w:left="720" w:hanging="360"/>
+              <w:jc w:val="left"/>
+            </w:pPr>
+            <w:r>
+              <w:rPr>
+                <w:rFonts w:ascii="Open Sans" w:hAnsi="Open Sans" w:eastAsia="Open Sans" w:cs="Open Sans"/>
+              </w:rPr>
               <w:t>Impedir que ultrapasse a capacidade máxima</w:t>
             </w:r>
           </w:p>
@@ -2808,6 +3618,12 @@
         <w:tc>
           <w:tcPr>
             <w:tcW w:w="2600" w:type="dxa"/>
+            <w:tcBorders>
+              <w:top w:val="single" w:sz="8" w:space="0" w:color="000000"/>
+              <w:left w:val="single" w:sz="8" w:space="0" w:color="000000"/>
+              <w:bottom w:val="single" w:sz="8" w:space="0" w:color="000000"/>
+              <w:right w:val="single" w:sz="8" w:space="0" w:color="000000"/>
+            </w:tcBorders>
             <w:tcMar>
               <w:top w:w="100" w:type="dxa"/>
               <w:left w:w="100" w:type="dxa"/>
@@ -2819,10 +3635,13 @@
             <w:pPr>
               <w:widowControl w:val="0"/>
               <w:spacing w:line="240" w:lineRule="auto"/>
-              <w:ind w:left="0" w:firstLine="0"/>
-              <w:jc w:val="left"/>
-            </w:pPr>
-            <w:r>
+              <w:ind w:left="0"/>
+              <w:jc w:val="left"/>
+            </w:pPr>
+            <w:r>
+              <w:rPr>
+                <w:rFonts w:ascii="Open Sans" w:hAnsi="Open Sans" w:eastAsia="Open Sans" w:cs="Open Sans"/>
+              </w:rPr>
               <w:t>Internação</w:t>
             </w:r>
           </w:p>
@@ -2830,10 +3649,13 @@
             <w:pPr>
               <w:widowControl w:val="0"/>
               <w:spacing w:line="240" w:lineRule="auto"/>
-              <w:ind w:left="0" w:firstLine="0"/>
-              <w:jc w:val="left"/>
-            </w:pPr>
-            <w:r>
+              <w:ind w:left="0"/>
+              <w:jc w:val="left"/>
+            </w:pPr>
+            <w:r>
+              <w:rPr>
+                <w:rFonts w:ascii="Open Sans" w:hAnsi="Open Sans" w:eastAsia="Open Sans" w:cs="Open Sans"/>
+              </w:rPr>
               <w:t>Situação do Quarto</w:t>
             </w:r>
           </w:p>
@@ -2842,7 +3664,8 @@
     </w:tbl>
     <w:p>
       <w:pPr>
-        <w:ind w:left="0" w:firstLine="0"/>
+        <w:ind w:left="0"/>
+        <w:jc w:val="both"/>
       </w:pPr>
     </w:p>
     <w:tbl>
@@ -2859,7 +3682,13 @@
           <w:insideV w:val="single" w:sz="8" w:space="0" w:color="000000"/>
         </w:tblBorders>
         <w:tblLayout w:type="fixed"/>
-        <w:tblLook w:val="0600" w:firstRow="0" w:lastRow="0" w:firstColumn="0" w:lastColumn="0" w:noHBand="1" w:noVBand="1"/>
+        <w:tblCellMar>
+          <w:top w:w="100" w:type="dxa"/>
+          <w:left w:w="100" w:type="dxa"/>
+          <w:bottom w:w="100" w:type="dxa"/>
+          <w:right w:w="100" w:type="dxa"/>
+        </w:tblCellMar>
+        <w:tblLook w:noHBand="1" w:noVBand="1"/>
       </w:tblPr>
       <w:tblGrid>
         <w:gridCol w:w="4960"/>
@@ -2874,6 +3703,12 @@
           <w:tcPr>
             <w:tcW w:w="7560" w:type="dxa"/>
             <w:gridSpan w:val="2"/>
+            <w:tcBorders>
+              <w:top w:val="single" w:sz="8" w:space="0" w:color="000000"/>
+              <w:left w:val="single" w:sz="8" w:space="0" w:color="000000"/>
+              <w:bottom w:val="single" w:sz="8" w:space="0" w:color="000000"/>
+              <w:right w:val="single" w:sz="8" w:space="0" w:color="000000"/>
+            </w:tcBorders>
             <w:tcMar>
               <w:top w:w="100" w:type="dxa"/>
               <w:left w:w="100" w:type="dxa"/>
@@ -2886,15 +3721,16 @@
               <w:keepNext/>
               <w:widowControl w:val="0"/>
               <w:spacing w:line="240" w:lineRule="auto"/>
-              <w:ind w:left="0" w:firstLine="0"/>
-              <w:jc w:val="left"/>
-              <w:rPr>
-                <w:b/>
-                <w:bCs/>
-              </w:rPr>
-            </w:pPr>
-            <w:r>
-              <w:rPr>
+              <w:ind w:left="0"/>
+              <w:jc w:val="left"/>
+              <w:rPr>
+                <w:b/>
+                <w:bCs/>
+              </w:rPr>
+            </w:pPr>
+            <w:r>
+              <w:rPr>
+                <w:rFonts w:ascii="Open Sans" w:hAnsi="Open Sans" w:eastAsia="Open Sans" w:cs="Open Sans"/>
                 <w:b/>
                 <w:bCs/>
               </w:rPr>
@@ -2910,6 +3746,12 @@
         <w:tc>
           <w:tcPr>
             <w:tcW w:w="4960" w:type="dxa"/>
+            <w:tcBorders>
+              <w:top w:val="single" w:sz="8" w:space="0" w:color="000000"/>
+              <w:left w:val="single" w:sz="8" w:space="0" w:color="000000"/>
+              <w:bottom w:val="single" w:sz="8" w:space="0" w:color="000000"/>
+              <w:right w:val="single" w:sz="8" w:space="0" w:color="000000"/>
+            </w:tcBorders>
             <w:tcMar>
               <w:top w:w="100" w:type="dxa"/>
               <w:left w:w="100" w:type="dxa"/>
@@ -2922,15 +3764,16 @@
               <w:keepNext/>
               <w:widowControl w:val="0"/>
               <w:spacing w:line="240" w:lineRule="auto"/>
-              <w:ind w:left="0" w:firstLine="0"/>
-              <w:jc w:val="left"/>
-              <w:rPr>
-                <w:b/>
-                <w:bCs/>
-              </w:rPr>
-            </w:pPr>
-            <w:r>
-              <w:rPr>
+              <w:ind w:left="0"/>
+              <w:jc w:val="left"/>
+              <w:rPr>
+                <w:b/>
+                <w:bCs/>
+              </w:rPr>
+            </w:pPr>
+            <w:r>
+              <w:rPr>
+                <w:rFonts w:ascii="Open Sans" w:hAnsi="Open Sans" w:eastAsia="Open Sans" w:cs="Open Sans"/>
                 <w:b/>
                 <w:bCs/>
               </w:rPr>
@@ -2941,6 +3784,12 @@
         <w:tc>
           <w:tcPr>
             <w:tcW w:w="2600" w:type="dxa"/>
+            <w:tcBorders>
+              <w:top w:val="single" w:sz="8" w:space="0" w:color="000000"/>
+              <w:left w:val="single" w:sz="8" w:space="0" w:color="000000"/>
+              <w:bottom w:val="single" w:sz="8" w:space="0" w:color="000000"/>
+              <w:right w:val="single" w:sz="8" w:space="0" w:color="000000"/>
+            </w:tcBorders>
             <w:tcMar>
               <w:top w:w="100" w:type="dxa"/>
               <w:left w:w="100" w:type="dxa"/>
@@ -2953,15 +3802,16 @@
               <w:keepNext/>
               <w:widowControl w:val="0"/>
               <w:spacing w:line="240" w:lineRule="auto"/>
-              <w:ind w:left="0" w:firstLine="0"/>
-              <w:jc w:val="left"/>
-              <w:rPr>
-                <w:b/>
-                <w:bCs/>
-              </w:rPr>
-            </w:pPr>
-            <w:r>
-              <w:rPr>
+              <w:ind w:left="0"/>
+              <w:jc w:val="left"/>
+              <w:rPr>
+                <w:b/>
+                <w:bCs/>
+              </w:rPr>
+            </w:pPr>
+            <w:r>
+              <w:rPr>
+                <w:rFonts w:ascii="Open Sans" w:hAnsi="Open Sans" w:eastAsia="Open Sans" w:cs="Open Sans"/>
                 <w:b/>
                 <w:bCs/>
               </w:rPr>
@@ -2977,6 +3827,12 @@
         <w:tc>
           <w:tcPr>
             <w:tcW w:w="4960" w:type="dxa"/>
+            <w:tcBorders>
+              <w:top w:val="single" w:sz="8" w:space="0" w:color="000000"/>
+              <w:left w:val="single" w:sz="8" w:space="0" w:color="000000"/>
+              <w:bottom w:val="single" w:sz="8" w:space="0" w:color="000000"/>
+              <w:right w:val="single" w:sz="8" w:space="0" w:color="000000"/>
+            </w:tcBorders>
             <w:tcMar>
               <w:top w:w="100" w:type="dxa"/>
               <w:left w:w="100" w:type="dxa"/>
@@ -2992,9 +3848,13 @@
                 <w:numId w:val="110"/>
               </w:numPr>
               <w:spacing w:line="240" w:lineRule="auto"/>
-              <w:jc w:val="left"/>
-            </w:pPr>
-            <w:r>
+              <w:ind w:left="720" w:hanging="360"/>
+              <w:jc w:val="left"/>
+            </w:pPr>
+            <w:r>
+              <w:rPr>
+                <w:rFonts w:ascii="Open Sans" w:hAnsi="Open Sans" w:eastAsia="Open Sans" w:cs="Open Sans"/>
+              </w:rPr>
               <w:t>Representar os estados possíveis: disponível e ocupado</w:t>
             </w:r>
           </w:p>
@@ -3002,6 +3862,12 @@
         <w:tc>
           <w:tcPr>
             <w:tcW w:w="2600" w:type="dxa"/>
+            <w:tcBorders>
+              <w:top w:val="single" w:sz="8" w:space="0" w:color="000000"/>
+              <w:left w:val="single" w:sz="8" w:space="0" w:color="000000"/>
+              <w:bottom w:val="single" w:sz="8" w:space="0" w:color="000000"/>
+              <w:right w:val="single" w:sz="8" w:space="0" w:color="000000"/>
+            </w:tcBorders>
             <w:tcMar>
               <w:top w:w="100" w:type="dxa"/>
               <w:left w:w="100" w:type="dxa"/>
@@ -3013,10 +3879,13 @@
             <w:pPr>
               <w:widowControl w:val="0"/>
               <w:spacing w:line="240" w:lineRule="auto"/>
-              <w:ind w:left="0" w:firstLine="0"/>
-              <w:jc w:val="left"/>
-            </w:pPr>
-            <w:r>
+              <w:ind w:left="0"/>
+              <w:jc w:val="left"/>
+            </w:pPr>
+            <w:r>
+              <w:rPr>
+                <w:rFonts w:ascii="Open Sans" w:hAnsi="Open Sans" w:eastAsia="Open Sans" w:cs="Open Sans"/>
+              </w:rPr>
               <w:t>—</w:t>
             </w:r>
           </w:p>
@@ -3025,7 +3894,8 @@
     </w:tbl>
     <w:p>
       <w:pPr>
-        <w:ind w:left="0" w:firstLine="0"/>
+        <w:ind w:left="0"/>
+        <w:jc w:val="both"/>
       </w:pPr>
     </w:p>
     <w:p>
@@ -3035,8 +3905,15 @@
           <w:ilvl w:val="1"/>
           <w:numId w:val="9"/>
         </w:numPr>
+        <w:ind w:left="1440" w:hanging="360"/>
+        <w:jc w:val="both"/>
       </w:pPr>
       <w:r>
+        <w:rPr>
+          <w:rFonts w:ascii="Roboto Light" w:hAnsi="Roboto Light" w:eastAsia="Roboto Light" w:cs="Roboto Light"/>
+          <w:sz w:val="28"/>
+          <w:szCs w:val="28"/>
+        </w:rPr>
         <w:t>Cartões CRC - Caso de Uso: Consultar Histórico Médico</w:t>
       </w:r>
     </w:p>
@@ -3054,7 +3931,13 @@
           <w:insideV w:val="single" w:sz="8" w:space="0" w:color="000000"/>
         </w:tblBorders>
         <w:tblLayout w:type="fixed"/>
-        <w:tblLook w:val="0600" w:firstRow="0" w:lastRow="0" w:firstColumn="0" w:lastColumn="0" w:noHBand="1" w:noVBand="1"/>
+        <w:tblCellMar>
+          <w:top w:w="100" w:type="dxa"/>
+          <w:left w:w="100" w:type="dxa"/>
+          <w:bottom w:w="100" w:type="dxa"/>
+          <w:right w:w="100" w:type="dxa"/>
+        </w:tblCellMar>
+        <w:tblLook w:noHBand="1" w:noVBand="1"/>
       </w:tblPr>
       <w:tblGrid>
         <w:gridCol w:w="4960"/>
@@ -3069,6 +3952,12 @@
           <w:tcPr>
             <w:tcW w:w="7560" w:type="dxa"/>
             <w:gridSpan w:val="2"/>
+            <w:tcBorders>
+              <w:top w:val="single" w:sz="8" w:space="0" w:color="000000"/>
+              <w:left w:val="single" w:sz="8" w:space="0" w:color="000000"/>
+              <w:bottom w:val="single" w:sz="8" w:space="0" w:color="000000"/>
+              <w:right w:val="single" w:sz="8" w:space="0" w:color="000000"/>
+            </w:tcBorders>
             <w:tcMar>
               <w:top w:w="100" w:type="dxa"/>
               <w:left w:w="100" w:type="dxa"/>
@@ -3081,15 +3970,16 @@
               <w:keepNext/>
               <w:widowControl w:val="0"/>
               <w:spacing w:line="240" w:lineRule="auto"/>
-              <w:ind w:left="0" w:firstLine="0"/>
-              <w:jc w:val="left"/>
-              <w:rPr>
-                <w:b/>
-                <w:bCs/>
-              </w:rPr>
-            </w:pPr>
-            <w:r>
-              <w:rPr>
+              <w:ind w:left="0"/>
+              <w:jc w:val="left"/>
+              <w:rPr>
+                <w:b/>
+                <w:bCs/>
+              </w:rPr>
+            </w:pPr>
+            <w:r>
+              <w:rPr>
+                <w:rFonts w:ascii="Open Sans" w:hAnsi="Open Sans" w:eastAsia="Open Sans" w:cs="Open Sans"/>
                 <w:b/>
                 <w:bCs/>
               </w:rPr>
@@ -3105,6 +3995,12 @@
         <w:tc>
           <w:tcPr>
             <w:tcW w:w="4960" w:type="dxa"/>
+            <w:tcBorders>
+              <w:top w:val="single" w:sz="8" w:space="0" w:color="000000"/>
+              <w:left w:val="single" w:sz="8" w:space="0" w:color="000000"/>
+              <w:bottom w:val="single" w:sz="8" w:space="0" w:color="000000"/>
+              <w:right w:val="single" w:sz="8" w:space="0" w:color="000000"/>
+            </w:tcBorders>
             <w:tcMar>
               <w:top w:w="100" w:type="dxa"/>
               <w:left w:w="100" w:type="dxa"/>
@@ -3117,15 +4013,16 @@
               <w:keepNext/>
               <w:widowControl w:val="0"/>
               <w:spacing w:line="240" w:lineRule="auto"/>
-              <w:ind w:left="0" w:firstLine="0"/>
-              <w:jc w:val="left"/>
-              <w:rPr>
-                <w:b/>
-                <w:bCs/>
-              </w:rPr>
-            </w:pPr>
-            <w:r>
-              <w:rPr>
+              <w:ind w:left="0"/>
+              <w:jc w:val="left"/>
+              <w:rPr>
+                <w:b/>
+                <w:bCs/>
+              </w:rPr>
+            </w:pPr>
+            <w:r>
+              <w:rPr>
+                <w:rFonts w:ascii="Open Sans" w:hAnsi="Open Sans" w:eastAsia="Open Sans" w:cs="Open Sans"/>
                 <w:b/>
                 <w:bCs/>
               </w:rPr>
@@ -3136,6 +4033,12 @@
         <w:tc>
           <w:tcPr>
             <w:tcW w:w="2600" w:type="dxa"/>
+            <w:tcBorders>
+              <w:top w:val="single" w:sz="8" w:space="0" w:color="000000"/>
+              <w:left w:val="single" w:sz="8" w:space="0" w:color="000000"/>
+              <w:bottom w:val="single" w:sz="8" w:space="0" w:color="000000"/>
+              <w:right w:val="single" w:sz="8" w:space="0" w:color="000000"/>
+            </w:tcBorders>
             <w:tcMar>
               <w:top w:w="100" w:type="dxa"/>
               <w:left w:w="100" w:type="dxa"/>
@@ -3148,15 +4051,16 @@
               <w:keepNext/>
               <w:widowControl w:val="0"/>
               <w:spacing w:line="240" w:lineRule="auto"/>
-              <w:ind w:left="0" w:firstLine="0"/>
-              <w:jc w:val="left"/>
-              <w:rPr>
-                <w:b/>
-                <w:bCs/>
-              </w:rPr>
-            </w:pPr>
-            <w:r>
-              <w:rPr>
+              <w:ind w:left="0"/>
+              <w:jc w:val="left"/>
+              <w:rPr>
+                <w:b/>
+                <w:bCs/>
+              </w:rPr>
+            </w:pPr>
+            <w:r>
+              <w:rPr>
+                <w:rFonts w:ascii="Open Sans" w:hAnsi="Open Sans" w:eastAsia="Open Sans" w:cs="Open Sans"/>
                 <w:b/>
                 <w:bCs/>
               </w:rPr>
@@ -3172,6 +4076,12 @@
         <w:tc>
           <w:tcPr>
             <w:tcW w:w="4960" w:type="dxa"/>
+            <w:tcBorders>
+              <w:top w:val="single" w:sz="8" w:space="0" w:color="000000"/>
+              <w:left w:val="single" w:sz="8" w:space="0" w:color="000000"/>
+              <w:bottom w:val="single" w:sz="8" w:space="0" w:color="000000"/>
+              <w:right w:val="single" w:sz="8" w:space="0" w:color="000000"/>
+            </w:tcBorders>
             <w:tcMar>
               <w:top w:w="100" w:type="dxa"/>
               <w:left w:w="100" w:type="dxa"/>
@@ -3187,9 +4097,13 @@
                 <w:numId w:val="111"/>
               </w:numPr>
               <w:spacing w:line="240" w:lineRule="auto"/>
-              <w:jc w:val="left"/>
-            </w:pPr>
-            <w:r>
+              <w:ind w:left="720" w:hanging="360"/>
+              <w:jc w:val="left"/>
+            </w:pPr>
+            <w:r>
+              <w:rPr>
+                <w:rFonts w:ascii="Open Sans" w:hAnsi="Open Sans" w:eastAsia="Open Sans" w:cs="Open Sans"/>
+              </w:rPr>
               <w:t>Conhecer o paciente a que se refere</w:t>
             </w:r>
           </w:p>
@@ -3201,9 +4115,13 @@
                 <w:numId w:val="111"/>
               </w:numPr>
               <w:spacing w:line="240" w:lineRule="auto"/>
-              <w:jc w:val="left"/>
-            </w:pPr>
-            <w:r>
+              <w:ind w:left="720" w:hanging="360"/>
+              <w:jc w:val="left"/>
+            </w:pPr>
+            <w:r>
+              <w:rPr>
+                <w:rFonts w:ascii="Open Sans" w:hAnsi="Open Sans" w:eastAsia="Open Sans" w:cs="Open Sans"/>
+              </w:rPr>
               <w:t>Conhecer as consultas realizadas</w:t>
             </w:r>
           </w:p>
@@ -3215,9 +4133,13 @@
                 <w:numId w:val="111"/>
               </w:numPr>
               <w:spacing w:line="240" w:lineRule="auto"/>
-              <w:jc w:val="left"/>
-            </w:pPr>
-            <w:r>
+              <w:ind w:left="720" w:hanging="360"/>
+              <w:jc w:val="left"/>
+            </w:pPr>
+            <w:r>
+              <w:rPr>
+                <w:rFonts w:ascii="Open Sans" w:hAnsi="Open Sans" w:eastAsia="Open Sans" w:cs="Open Sans"/>
+              </w:rPr>
               <w:t>Conhecer as internações realizadas</w:t>
             </w:r>
           </w:p>
@@ -3229,9 +4151,13 @@
                 <w:numId w:val="111"/>
               </w:numPr>
               <w:spacing w:line="240" w:lineRule="auto"/>
-              <w:jc w:val="left"/>
-            </w:pPr>
-            <w:r>
+              <w:ind w:left="720" w:hanging="360"/>
+              <w:jc w:val="left"/>
+            </w:pPr>
+            <w:r>
+              <w:rPr>
+                <w:rFonts w:ascii="Open Sans" w:hAnsi="Open Sans" w:eastAsia="Open Sans" w:cs="Open Sans"/>
+              </w:rPr>
               <w:t>Conhecer as informações relevantes registradas nos atendimentos</w:t>
             </w:r>
           </w:p>
@@ -3243,9 +4169,13 @@
                 <w:numId w:val="111"/>
               </w:numPr>
               <w:spacing w:line="240" w:lineRule="auto"/>
-              <w:jc w:val="left"/>
-            </w:pPr>
-            <w:r>
+              <w:ind w:left="720" w:hanging="360"/>
+              <w:jc w:val="left"/>
+            </w:pPr>
+            <w:r>
+              <w:rPr>
+                <w:rFonts w:ascii="Open Sans" w:hAnsi="Open Sans" w:eastAsia="Open Sans" w:cs="Open Sans"/>
+              </w:rPr>
               <w:t>Listar os atendimentos em ordem cronológica</w:t>
             </w:r>
           </w:p>
@@ -3257,9 +4187,13 @@
                 <w:numId w:val="111"/>
               </w:numPr>
               <w:spacing w:line="240" w:lineRule="auto"/>
-              <w:jc w:val="left"/>
-            </w:pPr>
-            <w:r>
+              <w:ind w:left="720" w:hanging="360"/>
+              <w:jc w:val="left"/>
+            </w:pPr>
+            <w:r>
+              <w:rPr>
+                <w:rFonts w:ascii="Open Sans" w:hAnsi="Open Sans" w:eastAsia="Open Sans" w:cs="Open Sans"/>
+              </w:rPr>
               <w:t>Filtrar os atendimentos por tipo (consulta ou internação)</w:t>
             </w:r>
           </w:p>
@@ -3267,6 +4201,12 @@
         <w:tc>
           <w:tcPr>
             <w:tcW w:w="2600" w:type="dxa"/>
+            <w:tcBorders>
+              <w:top w:val="single" w:sz="8" w:space="0" w:color="000000"/>
+              <w:left w:val="single" w:sz="8" w:space="0" w:color="000000"/>
+              <w:bottom w:val="single" w:sz="8" w:space="0" w:color="000000"/>
+              <w:right w:val="single" w:sz="8" w:space="0" w:color="000000"/>
+            </w:tcBorders>
             <w:tcMar>
               <w:top w:w="100" w:type="dxa"/>
               <w:left w:w="100" w:type="dxa"/>
@@ -3278,10 +4218,13 @@
             <w:pPr>
               <w:widowControl w:val="0"/>
               <w:spacing w:line="240" w:lineRule="auto"/>
-              <w:ind w:left="0" w:firstLine="0"/>
-              <w:jc w:val="left"/>
-            </w:pPr>
-            <w:r>
+              <w:ind w:left="0"/>
+              <w:jc w:val="left"/>
+            </w:pPr>
+            <w:r>
+              <w:rPr>
+                <w:rFonts w:ascii="Open Sans" w:hAnsi="Open Sans" w:eastAsia="Open Sans" w:cs="Open Sans"/>
+              </w:rPr>
               <w:t>Paciente</w:t>
             </w:r>
           </w:p>
@@ -3289,10 +4232,13 @@
             <w:pPr>
               <w:widowControl w:val="0"/>
               <w:spacing w:line="240" w:lineRule="auto"/>
-              <w:ind w:left="0" w:firstLine="0"/>
-              <w:jc w:val="left"/>
-            </w:pPr>
-            <w:r>
+              <w:ind w:left="0"/>
+              <w:jc w:val="left"/>
+            </w:pPr>
+            <w:r>
+              <w:rPr>
+                <w:rFonts w:ascii="Open Sans" w:hAnsi="Open Sans" w:eastAsia="Open Sans" w:cs="Open Sans"/>
+              </w:rPr>
               <w:t>Atendimento</w:t>
             </w:r>
           </w:p>
@@ -3300,10 +4246,13 @@
             <w:pPr>
               <w:widowControl w:val="0"/>
               <w:spacing w:line="240" w:lineRule="auto"/>
-              <w:ind w:left="0" w:firstLine="0"/>
-              <w:jc w:val="left"/>
-            </w:pPr>
-            <w:r>
+              <w:ind w:left="0"/>
+              <w:jc w:val="left"/>
+            </w:pPr>
+            <w:r>
+              <w:rPr>
+                <w:rFonts w:ascii="Open Sans" w:hAnsi="Open Sans" w:eastAsia="Open Sans" w:cs="Open Sans"/>
+              </w:rPr>
               <w:t>Consulta</w:t>
             </w:r>
           </w:p>
@@ -3311,10 +4260,13 @@
             <w:pPr>
               <w:widowControl w:val="0"/>
               <w:spacing w:line="240" w:lineRule="auto"/>
-              <w:ind w:left="0" w:firstLine="0"/>
-              <w:jc w:val="left"/>
-            </w:pPr>
-            <w:r>
+              <w:ind w:left="0"/>
+              <w:jc w:val="left"/>
+            </w:pPr>
+            <w:r>
+              <w:rPr>
+                <w:rFonts w:ascii="Open Sans" w:hAnsi="Open Sans" w:eastAsia="Open Sans" w:cs="Open Sans"/>
+              </w:rPr>
               <w:t>Internação</w:t>
             </w:r>
           </w:p>
@@ -3323,13 +4275,16 @@
     </w:tbl>
     <w:p>
       <w:pPr>
-        <w:ind w:left="0" w:firstLine="0"/>
+        <w:ind w:left="0"/>
+        <w:jc w:val="both"/>
       </w:pPr>
     </w:p>
     <w:sectPr>
+      <w:headerReference w:type="default" r:id="rId7"/>
+      <w:footerReference w:type="default" r:id="rId8"/>
       <w:pgSz w:w="11909" w:h="16834"/>
       <w:pgMar w:top="1440" w:right="1440" w:bottom="1440" w:left="1440" w:header="720" w:footer="720" w:gutter="0"/>
-      <w:cols w:space="720"/>
+      <w:titlePg/>
     </w:sectPr>
   </w:body>
 </w:document>
@@ -3361,7 +4316,7 @@
 </file>
 
 <file path=word/footer1.xml><?xml version="1.0" encoding="utf-8"?>
-<w:ftr xmlns:wpc="http://schemas.microsoft.com/office/word/2010/wordprocessingCanvas" xmlns:cx="http://schemas.microsoft.com/office/drawing/2014/chartex" xmlns:cx1="http://schemas.microsoft.com/office/drawing/2015/9/8/chartex" xmlns:cx2="http://schemas.microsoft.com/office/drawing/2015/10/21/chartex" xmlns:cx3="http://schemas.microsoft.com/office/drawing/2016/5/9/chartex" xmlns:cx4="http://schemas.microsoft.com/office/drawing/2016/5/10/chartex" xmlns:cx5="http://schemas.microsoft.com/office/drawing/2016/5/11/chartex" xmlns:cx6="http://schemas.microsoft.com/office/drawing/2016/5/12/chartex" xmlns:cx7="http://schemas.microsoft.com/office/drawing/2016/5/13/chartex" xmlns:cx8="http://schemas.microsoft.com/office/drawing/2016/5/14/chartex" xmlns:mc="http://schemas.openxmlformats.org/markup-compatibility/2006" xmlns:aink="http://schemas.microsoft.com/office/drawing/2016/ink" xmlns:am3d="http://schemas.microsoft.com/office/drawing/2017/model3d" xmlns:o="urn:schemas-microsoft-com:office:office" xmlns:oel="http://schemas.microsoft.com/office/2019/extlst" xmlns:r="http://schemas.openxmlformats.org/officeDocument/2006/relationships" xmlns:m="http://schemas.openxmlformats.org/officeDocument/2006/math" xmlns:v="urn:schemas-microsoft-com:vml" xmlns:wp14="http://schemas.microsoft.com/office/word/2010/wordprocessingDrawing" xmlns:wp="http://schemas.openxmlformats.org/drawingml/2006/wordprocessingDrawing" xmlns:w10="urn:schemas-microsoft-com:office:word" xmlns:w="http://schemas.openxmlformats.org/wordprocessingml/2006/main" xmlns:w14="http://schemas.microsoft.com/office/word/2010/wordml" xmlns:w15="http://schemas.microsoft.com/office/word/2012/wordml" xmlns:w16cex="http://schemas.microsoft.com/office/word/2018/wordml/cex" xmlns:w16cid="http://schemas.microsoft.com/office/word/2016/wordml/cid" xmlns:w16="http://schemas.microsoft.com/office/word/2018/wordml" xmlns:w16du="http://schemas.microsoft.com/office/word/2023/wordml/word16du" xmlns:w16sdtdh="http://schemas.microsoft.com/office/word/2020/wordml/sdtdatahash" xmlns:w16sdtfl="http://schemas.microsoft.com/office/word/2024/wordml/sdtformatlock" xmlns:w16se="http://schemas.microsoft.com/office/word/2015/wordml/symex" xmlns:wpg="http://schemas.microsoft.com/office/word/2010/wordprocessingGroup" xmlns:wpi="http://schemas.microsoft.com/office/word/2010/wordprocessingInk" xmlns:wne="http://schemas.microsoft.com/office/word/2006/wordml" xmlns:wps="http://schemas.microsoft.com/office/word/2010/wordprocessingShape" mc:Ignorable="w14 w15 w16se w16cid w16 w16cex w16sdtdh w16sdtfl w16du wp14">
+<w:ftr xmlns:wpc="http://schemas.microsoft.com/office/word/2010/wordprocessingCanvas" xmlns:mc="http://schemas.openxmlformats.org/markup-compatibility/2006" xmlns:o="urn:schemas-microsoft-com:office:office" xmlns:r="http://schemas.openxmlformats.org/officeDocument/2006/relationships" xmlns:m="http://schemas.openxmlformats.org/officeDocument/2006/math" xmlns:v="urn:schemas-microsoft-com:vml" xmlns:wp14="http://schemas.microsoft.com/office/word/2010/wordprocessingDrawing" xmlns:wp="http://schemas.openxmlformats.org/drawingml/2006/wordprocessingDrawing" xmlns:w10="urn:schemas-microsoft-com:office:word" xmlns:w="http://schemas.openxmlformats.org/wordprocessingml/2006/main" xmlns:w14="http://schemas.microsoft.com/office/word/2010/wordml" xmlns:w15="http://schemas.microsoft.com/office/word/2012/wordml" xmlns:w16se="http://schemas.microsoft.com/office/word/2015/wordml/symex" xmlns:w16cid="http://schemas.microsoft.com/office/word/2016/wordml/cid" xmlns:w16="http://schemas.microsoft.com/office/word/2018/wordml" xmlns:w16cex="http://schemas.microsoft.com/office/word/2018/wordml/cex" xmlns:w16sdtdh="http://schemas.microsoft.com/office/word/2020/wordml/sdtdatahash" xmlns:wne="http://schemas.microsoft.com/office/word/2006/wordml" xmlns:wpg="http://schemas.microsoft.com/office/word/2010/wordprocessingGroup" xmlns:wps="http://schemas.microsoft.com/office/word/2010/wordprocessingShape">
   <w:p>
     <w:pPr>
       <w:spacing w:line="240" w:lineRule="auto"/>
@@ -3396,7 +4351,7 @@
 </file>
 
 <file path=word/header1.xml><?xml version="1.0" encoding="utf-8"?>
-<w:hdr xmlns:wpc="http://schemas.microsoft.com/office/word/2010/wordprocessingCanvas" xmlns:cx="http://schemas.microsoft.com/office/drawing/2014/chartex" xmlns:cx1="http://schemas.microsoft.com/office/drawing/2015/9/8/chartex" xmlns:cx2="http://schemas.microsoft.com/office/drawing/2015/10/21/chartex" xmlns:cx3="http://schemas.microsoft.com/office/drawing/2016/5/9/chartex" xmlns:cx4="http://schemas.microsoft.com/office/drawing/2016/5/10/chartex" xmlns:cx5="http://schemas.microsoft.com/office/drawing/2016/5/11/chartex" xmlns:cx6="http://schemas.microsoft.com/office/drawing/2016/5/12/chartex" xmlns:cx7="http://schemas.microsoft.com/office/drawing/2016/5/13/chartex" xmlns:cx8="http://schemas.microsoft.com/office/drawing/2016/5/14/chartex" xmlns:mc="http://schemas.openxmlformats.org/markup-compatibility/2006" xmlns:aink="http://schemas.microsoft.com/office/drawing/2016/ink" xmlns:am3d="http://schemas.microsoft.com/office/drawing/2017/model3d" xmlns:o="urn:schemas-microsoft-com:office:office" xmlns:oel="http://schemas.microsoft.com/office/2019/extlst" xmlns:r="http://schemas.openxmlformats.org/officeDocument/2006/relationships" xmlns:m="http://schemas.openxmlformats.org/officeDocument/2006/math" xmlns:v="urn:schemas-microsoft-com:vml" xmlns:wp14="http://schemas.microsoft.com/office/word/2010/wordprocessingDrawing" xmlns:wp="http://schemas.openxmlformats.org/drawingml/2006/wordprocessingDrawing" xmlns:w10="urn:schemas-microsoft-com:office:word" xmlns:w="http://schemas.openxmlformats.org/wordprocessingml/2006/main" xmlns:w14="http://schemas.microsoft.com/office/word/2010/wordml" xmlns:w15="http://schemas.microsoft.com/office/word/2012/wordml" xmlns:w16cex="http://schemas.microsoft.com/office/word/2018/wordml/cex" xmlns:w16cid="http://schemas.microsoft.com/office/word/2016/wordml/cid" xmlns:w16="http://schemas.microsoft.com/office/word/2018/wordml" xmlns:w16du="http://schemas.microsoft.com/office/word/2023/wordml/word16du" xmlns:w16sdtdh="http://schemas.microsoft.com/office/word/2020/wordml/sdtdatahash" xmlns:w16sdtfl="http://schemas.microsoft.com/office/word/2024/wordml/sdtformatlock" xmlns:w16se="http://schemas.microsoft.com/office/word/2015/wordml/symex" xmlns:wpg="http://schemas.microsoft.com/office/word/2010/wordprocessingGroup" xmlns:wpi="http://schemas.microsoft.com/office/word/2010/wordprocessingInk" xmlns:wne="http://schemas.microsoft.com/office/word/2006/wordml" xmlns:wps="http://schemas.microsoft.com/office/word/2010/wordprocessingShape" mc:Ignorable="w14 w15 w16se w16cid w16 w16cex w16sdtdh w16sdtfl w16du wp14">
+<w:hdr xmlns:wpc="http://schemas.microsoft.com/office/word/2010/wordprocessingCanvas" xmlns:mc="http://schemas.openxmlformats.org/markup-compatibility/2006" xmlns:o="urn:schemas-microsoft-com:office:office" xmlns:r="http://schemas.openxmlformats.org/officeDocument/2006/relationships" xmlns:m="http://schemas.openxmlformats.org/officeDocument/2006/math" xmlns:v="urn:schemas-microsoft-com:vml" xmlns:wp14="http://schemas.microsoft.com/office/word/2010/wordprocessingDrawing" xmlns:wp="http://schemas.openxmlformats.org/drawingml/2006/wordprocessingDrawing" xmlns:w10="urn:schemas-microsoft-com:office:word" xmlns:w="http://schemas.openxmlformats.org/wordprocessingml/2006/main" xmlns:w14="http://schemas.microsoft.com/office/word/2010/wordml" xmlns:w15="http://schemas.microsoft.com/office/word/2012/wordml" xmlns:w16se="http://schemas.microsoft.com/office/word/2015/wordml/symex" xmlns:w16cid="http://schemas.microsoft.com/office/word/2016/wordml/cid" xmlns:w16="http://schemas.microsoft.com/office/word/2018/wordml" xmlns:w16cex="http://schemas.microsoft.com/office/word/2018/wordml/cex" xmlns:w16sdtdh="http://schemas.microsoft.com/office/word/2020/wordml/sdtdatahash" xmlns:wne="http://schemas.microsoft.com/office/word/2006/wordml" xmlns:wpg="http://schemas.microsoft.com/office/word/2010/wordprocessingGroup" xmlns:wps="http://schemas.microsoft.com/office/word/2010/wordprocessingShape">
   <w:p>
     <w:pPr>
       <w:spacing w:line="240" w:lineRule="auto"/>
@@ -3416,7 +4371,7 @@
         <w:insideV w:val="single" w:sz="8" w:space="0" w:color="000000"/>
       </w:tblBorders>
       <w:tblLayout w:type="fixed"/>
-      <w:tblLook w:val="0600" w:firstRow="0" w:lastRow="0" w:firstColumn="0" w:lastColumn="0" w:noHBand="1" w:noVBand="1"/>
+      <w:tblLook w:noHBand="1" w:noVBand="1"/>
     </w:tblPr>
     <w:tblGrid>
       <w:gridCol w:w="4950"/>
@@ -3451,15 +4406,15 @@
               <w:between w:val="nil"/>
             </w:pBdr>
             <w:spacing w:line="240" w:lineRule="auto"/>
-            <w:ind w:left="0" w:firstLine="0"/>
+            <w:ind w:left="0"/>
             <w:jc w:val="left"/>
             <w:rPr>
-              <w:rFonts w:ascii="Saira SemiCondensed Medium" w:eastAsia="Saira SemiCondensed Medium" w:hAnsi="Saira SemiCondensed Medium" w:cs="Saira SemiCondensed Medium"/>
+              <w:rFonts w:ascii="Saira SemiCondensed Medium" w:hAnsi="Saira SemiCondensed Medium" w:eastAsia="Saira SemiCondensed Medium" w:cs="Saira SemiCondensed Medium"/>
             </w:rPr>
           </w:pPr>
           <w:r>
             <w:rPr>
-              <w:rFonts w:ascii="Saira SemiCondensed Medium" w:eastAsia="Saira SemiCondensed Medium" w:hAnsi="Saira SemiCondensed Medium" w:cs="Saira SemiCondensed Medium"/>
+              <w:rFonts w:ascii="Saira SemiCondensed Medium" w:hAnsi="Saira SemiCondensed Medium" w:eastAsia="Saira SemiCondensed Medium" w:cs="Saira SemiCondensed Medium"/>
             </w:rPr>
             <w:t>Classe – Responsabilidade – Colaborador (CRC)</w:t>
           </w:r>
@@ -3491,7 +4446,7 @@
               <w:between w:val="nil"/>
             </w:pBdr>
             <w:spacing w:line="240" w:lineRule="auto"/>
-            <w:ind w:left="0" w:firstLine="0"/>
+            <w:ind w:left="0"/>
             <w:jc w:val="left"/>
           </w:pPr>
         </w:p>
@@ -3522,10 +4477,10 @@
               <w:between w:val="nil"/>
             </w:pBdr>
             <w:spacing w:line="240" w:lineRule="auto"/>
-            <w:ind w:left="0" w:firstLine="0"/>
+            <w:ind w:left="0"/>
             <w:jc w:val="right"/>
             <w:rPr>
-              <w:rFonts w:ascii="Saira SemiCondensed Medium" w:eastAsia="Saira SemiCondensed Medium" w:hAnsi="Saira SemiCondensed Medium" w:cs="Saira SemiCondensed Medium"/>
+              <w:rFonts w:ascii="Saira SemiCondensed Medium" w:hAnsi="Saira SemiCondensed Medium" w:eastAsia="Saira SemiCondensed Medium" w:cs="Saira SemiCondensed Medium"/>
             </w:rPr>
           </w:pPr>
         </w:p>

</xml_diff>